<commit_message>
Kit del reto sin supuestos (Arranque max 2 pagos, ya-sabe-ingles via gerencia, ubicacion al dia siguiente, abono no cuenta, cuenta en induccion); Orden Plan Empresa: cambio de persona solo antes del inicio; modelo de carta de postulacion de empresa aliada
Co-Authored-By: Claude Fable 5.1 <noreply@anthropic.com>
</commit_message>
<xml_diff>
--- a/recursos/comercial/INDUCCION_COMERCIAL/contratacion comercial/KIT_ARRANQUE_RETO_15_DIAS_ALIANZAS.docx
+++ b/recursos/comercial/INDUCCION_COMERCIAL/contratacion comercial/KIT_ARRANQUE_RETO_15_DIAS_ALIANZAS.docx
@@ -2258,7 +2258,7 @@
                 <w:b w:val="0"/>
                 <w:sz w:val="17"/>
               </w:rPr>
-              <w:t>Contado. Arranque a cuotas: SUPUESTO — verificar con gerencia.</w:t>
+              <w:t>Contado o máximo dos pagos: la mitad al inscribirse y la otra mitad antes de la primera clase; no hay más cuotas.</w:t>
             </w:r>
           </w:p>
         </w:tc>
@@ -2311,7 +2311,7 @@
           <w:b w:val="0"/>
           <w:sz w:val="18"/>
         </w:rPr>
-        <w:t xml:space="preserve"> el valor de los paquetes parciales (A2 a B2, B1 a B2, solo B2) para aliados: SUPUESTO — verificar con gerencia. El nivel lo define la academia en la sesión de ubicación.</w:t>
+        <w:t xml:space="preserve"> puede entrar a un grupo que ya va andando, pero eso lo define y lo cotiza gerencia, caso por caso; tú lo agendas, no lo cierras. El foco del reto es la gente que empieza de cero: es lo más fácil de cerrar y lo que abre el grupo del 3 de noviembre.</w:t>
       </w:r>
     </w:p>
     <w:p>
@@ -2351,7 +2351,7 @@
           <w:b w:val="0"/>
           <w:sz w:val="18"/>
         </w:rPr>
-        <w:t xml:space="preserve"> para dar en la charla: SUPUESTO — verificar con gerencia el lunes 20 (no lo escribas de memoria).</w:t>
+        <w:t xml:space="preserve"> para dar en la charla: te lo entrega gerencia en la inducción del lunes 20. No lo escribas de memoria.</w:t>
       </w:r>
     </w:p>
     <w:p>
@@ -2522,7 +2522,7 @@
                 <w:b w:val="0"/>
                 <w:sz w:val="17"/>
               </w:rPr>
-              <w:t>Lo haces tú, en la charla o en el seguimiento (llamada o en la sede), en unos 20 minutos. Orden: motivo, para quién y quién decide, nivel, jornada, El Pacto, forma de pago; solo entonces el número exacto. "Ya sé algo": sesión de ubicación; quién la hace y cuándo: SUPUESTO — verificar con gerencia.</w:t>
+              <w:t>Lo haces tú, en la charla o en el seguimiento (llamada o en la sede), en unos 20 minutos. Orden: motivo, para quién y quién decide, nivel, jornada, El Pacto, forma de pago; solo entonces el número exacto. "Ya sé algo": la sesión de ubicación se coordina con la academia para el día siguiente, sin excepción; tú la agendas en el acto y gerencia define en qué grupo entra.</w:t>
             </w:r>
           </w:p>
         </w:tc>
@@ -2778,7 +2778,7 @@
                 <w:b w:val="0"/>
                 <w:sz w:val="18"/>
               </w:rPr>
-              <w:t xml:space="preserve"> una promesa de pago, un pantallazo sin verificar, dinero que alguien te entregue a ti. Si el abono de separación de $300.000 cuenta como inicial para el reto: SUPUESTO — verificar con gerencia.</w:t>
+              <w:t xml:space="preserve"> una promesa de pago, un pantallazo sin verificar, dinero que alguien te entregue a ti. El abono de separación de $300.000 NO cuenta: solo la inicial del 20% o el pago de contado.</w:t>
             </w:r>
           </w:p>
         </w:tc>
@@ -3835,7 +3835,7 @@
                 <w:b w:val="0"/>
                 <w:sz w:val="17"/>
               </w:rPr>
-              <w:t>Queda en firme con firma de gerencia y pago inicial. El cambio de persona vale hasta antes de la primera clase (gerencia), aunque el numeral 3 diga otra cosa.</w:t>
+              <w:t>Queda en firme con firma de gerencia y pago inicial. La empresa puede cambiar a la persona solo antes del inicio y sin cambiar de horario.</w:t>
             </w:r>
           </w:p>
         </w:tc>
@@ -4020,7 +4020,7 @@
           <w:i w:val="0"/>
           <w:sz w:val="18"/>
         </w:rPr>
-        <w:t>Además: este kit, la planilla en el celular, 10 hojas INTERESADOS impresas y la carta de postulación de la empresa para cada colaborador (modelo: SUPUESTO — verificar con gerencia). Transporte y celular son tuyos.</w:t>
+        <w:t>Además: este kit, la planilla en el celular, 10 hojas INTERESADOS impresas y la carta de postulación de la empresa para cada colaborador (modelo: CARTA_POSTULACION_EMPRESA_ALIADA.pdf, en B2B/). Transporte y celular son tuyos.</w:t>
       </w:r>
     </w:p>
     <w:sectPr>

</xml_diff>

<commit_message>
Reto y kit: fechas reales (lunes 19/10, 11 dias habiles), inscrito pagado definido sin porcentajes, sin regla de base de datos, una sola fecha de inicio (3/11), clases sin 'ingles desde el dia 1' ni simulaciones, grupos de maximo 16, Modulo de Graduacion y condiciones de la garantia ampliados, plan empresa desde 3 cupos
Co-Authored-By: Claude Fable 5.1 <noreply@anthropic.com>
</commit_message>
<xml_diff>
--- a/recursos/comercial/INDUCCION_COMERCIAL/contratacion comercial/KIT_ARRANQUE_RETO_15_DIAS_ALIANZAS.docx
+++ b/recursos/comercial/INDUCCION_COMERCIAL/contratacion comercial/KIT_ARRANQUE_RETO_15_DIAS_ALIANZAS.docx
@@ -26,7 +26,7 @@
           <w:color w:val="666666"/>
           <w:sz w:val="19"/>
         </w:rPr>
-        <w:t>Heiiu English Academy · Para el ejecutivo de alianzas · Del lunes 20 de octubre al martes 3 de noviembre de 2026 · Léelo el domingo; llévalo el lunes</w:t>
+        <w:t>Heiiu English Academy · Para el ejecutivo de alianzas · Del lunes 19 de octubre al martes 3 de noviembre de 2026 · Léelo completo antes del lunes</w:t>
       </w:r>
     </w:p>
     <w:tbl>
@@ -60,7 +60,7 @@
                 <w:b w:val="0"/>
                 <w:sz w:val="19"/>
               </w:rPr>
-              <w:t xml:space="preserve"> 10 personas inscritas con la inicial pagada en la cuenta de Heiiu al martes 3 de noviembre a las 6:00 p. m., traídas por ti: empresas, referidos o conocidos. Cada persona queda registrada en tu planilla antes de pagar; no cuentan los que ya estaban en la base de Heiiu.</w:t>
+              <w:t xml:space="preserve"> 10 personas inscritas y pagadas en la cuenta de Heiiu al martes 3 de noviembre a las 6:00 p. m., traídas por ti: empresas, referidos o conocidos. Cada persona queda registrada en tu planilla antes de pagar. Inscrito pagado = pagó de contado, o pagó la inicial de su plan de pagos y firmó el contrato con coordinación. Lo ideal es de contado.</w:t>
             </w:r>
           </w:p>
           <w:p>
@@ -93,7 +93,7 @@
                 <w:b w:val="0"/>
                 <w:sz w:val="19"/>
               </w:rPr>
-              <w:t>, en la charla o en el seguimiento. No hay asesora ni cita con asesora. El pago entra a Heiiu; coordinación recibe el pago y firma contrato y pagaré con cada estudiante en la sede, a donde tú lo llevas o lo envías.</w:t>
+              <w:t>, en la charla o en el seguimiento. No hay asesora ni cita con asesora. El pago entra a Heiiu, de contado idealmente. El estudiante firma el contrato con coordinación en la sede, y pagaré solo si va a cuotas.</w:t>
             </w:r>
           </w:p>
           <w:p>
@@ -112,7 +112,7 @@
                 <w:b w:val="0"/>
                 <w:sz w:val="19"/>
               </w:rPr>
-              <w:t xml:space="preserve"> 15 minutos con gerencia todos los días a las 8:00 a. m. (el lunes 20 en la sede, después por llamada): qué hiciste ayer y qué empresas tienes hoy. La planilla FORMATO_15_EMPRESAS_RETO.xlsx siempre al día.</w:t>
+              <w:t xml:space="preserve"> 15 minutos con gerencia todos los días a las 8:00 a. m. (el lunes 19 en la sede, después por llamada): qué hiciste ayer y qué empresas tienes hoy. La planilla FORMATO_15_EMPRESAS_RETO.xlsx siempre al día.</w:t>
             </w:r>
           </w:p>
         </w:tc>
@@ -287,7 +287,7 @@
           <w:b w:val="0"/>
           <w:sz w:val="19"/>
         </w:rPr>
-        <w:t xml:space="preserve"> abre el martes 3 de noviembre o el lunes 9 de noviembre. Jornada de mañana, tarde o noche, de 2 o de 4 horas diarias: el horario lo definen los primeros que se matriculen; una empresa con 8 cupos o más define su propio horario. Para entrar el 3 de noviembre, la inicial tiene que estar pagada antes de esa fecha. Sábados de 8:00 a 12:00, un nivel a la vez.</w:t>
+        <w:t xml:space="preserve"> abre el martes 3 de noviembre. Jornada de mañana, tarde o noche, de 2 o de 4 horas diarias: el horario lo definen los primeros que se matriculen; una empresa con 8 cupos o más define su propio horario. Para entrar el 3 de noviembre, la inicial tiene que estar pagada antes de esa fecha. Sábados de 8:00 a 12:00, un nivel a la vez.</w:t>
       </w:r>
     </w:p>
     <w:p>
@@ -307,7 +307,7 @@
           <w:b w:val="0"/>
           <w:sz w:val="19"/>
         </w:rPr>
-        <w:t xml:space="preserve"> en grupo pequeño, habladas en inglés desde la primera clase, con una simulación real en cada clase (entrevista, llamada, reunión) y el profesor como coach; video corto diario en inglés que el profesor revisa; una virtud por bloque.</w:t>
+        <w:t xml:space="preserve"> presenciales, en grupos de máximo 16, con método activo y práctico; video corto diario en inglés que el profesor revisa; una virtud por bloque.</w:t>
       </w:r>
     </w:p>
     <w:p>
@@ -337,13 +337,6 @@
       </w:pPr>
       <w:r>
         <w:rPr>
-          <w:b w:val="0"/>
-          <w:sz w:val="19"/>
-        </w:rPr>
-        <w:t xml:space="preserve">Al terminar A2, </w:t>
-      </w:r>
-      <w:r>
-        <w:rPr>
           <w:b/>
           <w:sz w:val="19"/>
         </w:rPr>
@@ -354,7 +347,55 @@
           <w:b w:val="0"/>
           <w:sz w:val="19"/>
         </w:rPr>
-        <w:t xml:space="preserve"> a elección: Emprendedor (página web y primer mensaje de venta en inglés) o Pasaporte (video de presentación, hoja de vida, entrevista ensayada). Con el completo, Refuerzo PRO al final de B2. Se describen, nunca se promete un resultado.</w:t>
+        <w:t xml:space="preserve"> (al terminar A2, incluido en el Arranque y en el completo), a elección: </w:t>
+      </w:r>
+      <w:r>
+        <w:rPr>
+          <w:b/>
+          <w:sz w:val="19"/>
+        </w:rPr>
+        <w:t>Emprendedor</w:t>
+      </w:r>
+      <w:r>
+        <w:rPr>
+          <w:b w:val="0"/>
+          <w:sz w:val="19"/>
+        </w:rPr>
+        <w:t xml:space="preserve">, sale con su página web publicada en inglés, su pitch y su primer mensaje de venta a un cliente real; o </w:t>
+      </w:r>
+      <w:r>
+        <w:rPr>
+          <w:b/>
+          <w:sz w:val="19"/>
+        </w:rPr>
+        <w:t>Pasaporte</w:t>
+      </w:r>
+      <w:r>
+        <w:rPr>
+          <w:b w:val="0"/>
+          <w:sz w:val="19"/>
+        </w:rPr>
+        <w:t>, sale con el video de presentación, la hoja de vida en inglés, la entrevista ensayada y la postulación al exterior lista. Con el completo, además, Refuerzo PRO al final de B2. Se describen, nunca se promete un resultado. Dilo en toda charla: es lo que diferencia el programa de un curso.</w:t>
+      </w:r>
+    </w:p>
+    <w:p>
+      <w:pPr>
+        <w:pStyle w:val="ListBullet"/>
+        <w:spacing w:after="0"/>
+      </w:pPr>
+      <w:r>
+        <w:rPr>
+          <w:b/>
+          <w:sz w:val="19"/>
+        </w:rPr>
+        <w:t>La garantía, condiciones que el estudiante firma:</w:t>
+      </w:r>
+      <w:r>
+        <w:rPr>
+          <w:b w:val="0"/>
+          <w:sz w:val="19"/>
+        </w:rPr>
+        <w:t xml:space="preserve"> asistencia (hasta 20% de faltas por nivel; con incapacidad médica no cuentan), tareas al 90% (el video diario se graba en casa) y todas las evaluaciones. Si falta, recupera hasta dos clases al mes en el taller de los sábados. Tres llegadas tarde de más de 15 minutos suman una falta. Retracto: 5 días hábiles por ley; después no hay devolución por retiro, solo por garantía. Dilo antes de que firme, no después.</w:t>
       </w:r>
     </w:p>
     <w:p>
@@ -374,7 +415,7 @@
           <w:b w:val="0"/>
           <w:sz w:val="19"/>
         </w:rPr>
-        <w:t xml:space="preserve"> (para la reunión): educativa, formar a jóvenes y trabajadores de Santander a través del inglés con valores y disciplina; empresarial, las empresas locales pueden ganar con calidad, resultados que se pueden mostrar y garantía por escrito.</w:t>
+        <w:t xml:space="preserve"> (para la reunión con el dueño o gerente): educativa, formar a jóvenes y trabajadores de Santander a través del inglés con valores y disciplina; empresarial, las empresas locales pueden ganar con calidad, resultados que se pueden mostrar y garantía por escrito.</w:t>
       </w:r>
     </w:p>
     <w:p>
@@ -1686,7 +1727,7 @@
                 <w:b w:val="0"/>
                 <w:sz w:val="17"/>
               </w:rPr>
-              <w:t>Presenciales, grupo pequeño, inglés desde la primera clase, una simulación real por clase, video diario, una virtud por bloque. El grupo abre el 3 o el 9 de noviembre; mañana, tarde o noche, de 2 o 4 horas diarias, y el horario lo definen los primeros que se matriculan. La garantía, con su texto exacto.</w:t>
+              <w:t>Presenciales, grupos de máximo 16, método activo y práctico, video diario, una virtud por bloque. El Módulo de Graduación en una frase: Emprendedor o Pasaporte. El grupo abre el 3 de noviembre; mañana, tarde o noche, de 2 o 4 horas diarias, y el horario lo definen los primeros que se matriculan. La garantía, con su texto exacto y sus condiciones.</w:t>
             </w:r>
           </w:p>
         </w:tc>
@@ -2063,7 +2104,7 @@
                 <w:b w:val="0"/>
                 <w:sz w:val="17"/>
               </w:rPr>
-              <w:t>Solo si la empresa firmó la Orden Plan Empresa</w:t>
+              <w:t>Solo si la empresa firmó la Orden Plan Empresa (existe desde 3 cupos; con menos, los empleados pagan con la beca de alianza)</w:t>
             </w:r>
           </w:p>
         </w:tc>
@@ -2351,7 +2392,7 @@
           <w:b w:val="0"/>
           <w:sz w:val="18"/>
         </w:rPr>
-        <w:t xml:space="preserve"> para dar en la charla: te lo entrega gerencia en la inducción del lunes 20. No lo escribas de memoria.</w:t>
+        <w:t xml:space="preserve"> para dar en la charla: te lo entrega gerencia en la inducción del lunes 19. No lo escribas de memoria.</w:t>
       </w:r>
     </w:p>
     <w:p>
@@ -2681,7 +2722,7 @@
                 <w:b w:val="0"/>
                 <w:sz w:val="17"/>
               </w:rPr>
-              <w:t>Grupo del 3 o del 9 de noviembre; el horario lo definen los primeros matriculados (empresa con 8 o más: su propio horario). Plan Empresa: la orden la firma gerencia y la empresa designa a sus colaboradores; puede cambiar a la persona antes de la primera clase sin cambiar de horario.</w:t>
+              <w:t>Grupo del 3 de noviembre; el horario lo definen los primeros matriculados (empresa con 8 o más: su propio horario). Plan Empresa: la orden la firma gerencia y la empresa designa a sus colaboradores; puede cambiar a la persona antes de la primera clase sin cambiar de horario.</w:t>
             </w:r>
           </w:p>
         </w:tc>
@@ -3269,7 +3310,7 @@
           <w:b w:val="0"/>
           <w:sz w:val="19"/>
         </w:rPr>
-        <w:t>Solo dos fechas de inicio: martes 3 o lunes 9 de noviembre. No se promete horario: lo definen los primeros matriculados.</w:t>
+        <w:t>Una sola fecha de inicio: martes 3 de noviembre. No se promete horario: lo definen los primeros matriculados.</w:t>
       </w:r>
     </w:p>
     <w:p>
@@ -3402,7 +3443,7 @@
                 <w:b/>
                 <w:sz w:val="17"/>
               </w:rPr>
-              <w:t>Lun 20/10</w:t>
+              <w:t>Lun 19/10</w:t>
             </w:r>
           </w:p>
         </w:tc>
@@ -3438,7 +3479,7 @@
                 <w:b/>
                 <w:sz w:val="17"/>
               </w:rPr>
-              <w:t>Mar 21/10</w:t>
+              <w:t>Mar 20/10</w:t>
             </w:r>
           </w:p>
         </w:tc>
@@ -3488,7 +3529,7 @@
                 <w:b/>
                 <w:sz w:val="17"/>
               </w:rPr>
-              <w:t>Mié 22 a vie 24/10</w:t>
+              <w:t>Mié 21 a vie 23/10</w:t>
             </w:r>
           </w:p>
         </w:tc>
@@ -3538,7 +3579,7 @@
                 <w:b/>
                 <w:sz w:val="17"/>
               </w:rPr>
-              <w:t>Lun 27 a vie 31/10</w:t>
+              <w:t>Lun 26 a vie 30/10</w:t>
             </w:r>
           </w:p>
         </w:tc>
@@ -3555,7 +3596,7 @@
                 <w:b w:val="0"/>
                 <w:sz w:val="17"/>
               </w:rPr>
-              <w:t>Charlas, cierres e inscripciones. Recomendación: charlas hechas a más tardar el jueves 30, para que los pagos alcancen a entrar antes del corte y los inscritos puedan abrir grupo el 3 de noviembre.</w:t>
+              <w:t>Charlas, cierres e inscripciones. Recomendación: charlas hechas a más tardar el jueves 29, para que los pagos alcancen a entrar antes del corte y los inscritos puedan abrir grupo el 3 de noviembre.</w:t>
             </w:r>
           </w:p>
         </w:tc>
@@ -3634,7 +3675,7 @@
                 <w:b w:val="0"/>
                 <w:sz w:val="17"/>
               </w:rPr>
-              <w:t xml:space="preserve"> inscritos con inicial pagada y verificada por coordinación. Planilla cerrada y cuenta de cobro. Ese mismo día abre el grupo del 3 de noviembre (el siguiente, el lunes 9).</w:t>
+              <w:t xml:space="preserve"> inscritos con inicial pagada y verificada por coordinación. Planilla cerrada y cuenta de cobro. Ese mismo día abre el grupo del 3 de noviembre.</w:t>
             </w:r>
           </w:p>
         </w:tc>

</xml_diff>

<commit_message>
Kit v2 (6 pags): seguimiento 8:30, seccion 'lo que nos diferencia' (garantia, mentor, graduacion, virtudes), Pacto con trabajo fuera de clase, niveles y dos caminos, mensaje al gerente lo escribe el, reunion con plan empresa primero y activacion inmediata, ingles para empresarios, por que beca y no descuento, proceso solo si toca activacion, compensacion al final; reto con leads avanzados
Co-Authored-By: Claude Fable 5.1 <noreply@anthropic.com>
</commit_message>
<xml_diff>
--- a/recursos/comercial/INDUCCION_COMERCIAL/contratacion comercial/KIT_ARRANQUE_RETO_15_DIAS_ALIANZAS.docx
+++ b/recursos/comercial/INDUCCION_COMERCIAL/contratacion comercial/KIT_ARRANQUE_RETO_15_DIAS_ALIANZAS.docx
@@ -79,21 +79,7 @@
                 <w:b w:val="0"/>
                 <w:sz w:val="19"/>
               </w:rPr>
-              <w:t xml:space="preserve"> contactas al dueño o gerente, te reúnes con quien decide, das una charla de 20 minutos a sus empleados, presentas y </w:t>
-            </w:r>
-            <w:r>
-              <w:rPr>
-                <w:b/>
-                <w:sz w:val="19"/>
-              </w:rPr>
-              <w:t>cierras tú mismo</w:t>
-            </w:r>
-            <w:r>
-              <w:rPr>
-                <w:b w:val="0"/>
-                <w:sz w:val="19"/>
-              </w:rPr>
-              <w:t>, en la charla o en el seguimiento. No hay asesora ni cita con asesora. El pago entra a Heiiu, de contado idealmente. El estudiante firma el contrato con coordinación en la sede, y pagaré solo si va a cuotas.</w:t>
+              <w:t xml:space="preserve"> contactas al dueño o gerente, te reúnes con quien decide, y cierras tú mismo: lo preferido es que la empresa invierta (plan empresa); si no, la charla de 20 minutos a sus empleados y la inscripción de cada uno con la beca de alianza. El pago entra a Heiiu, de contado idealmente. El estudiante firma el contrato con coordinación en la sede, y pagaré solo si va a cuotas.</w:t>
             </w:r>
           </w:p>
           <w:p>
@@ -112,7 +98,40 @@
                 <w:b w:val="0"/>
                 <w:sz w:val="19"/>
               </w:rPr>
-              <w:t xml:space="preserve"> 15 minutos con gerencia todos los días a las 8:00 a. m. (el lunes 19 en la sede, después por llamada): qué hiciste ayer y qué empresas tienes hoy. La planilla FORMATO_15_EMPRESAS_RETO.xlsx siempre al día.</w:t>
+              <w:t xml:space="preserve"> 15 minutos con gerencia todos los días a las </w:t>
+            </w:r>
+            <w:r>
+              <w:rPr>
+                <w:b/>
+                <w:sz w:val="19"/>
+              </w:rPr>
+              <w:t>8:30 a. m.</w:t>
+            </w:r>
+            <w:r>
+              <w:rPr>
+                <w:b w:val="0"/>
+                <w:sz w:val="19"/>
+              </w:rPr>
+              <w:t xml:space="preserve"> (el lunes 19 en la sede, después por llamada): rutina del día, dudas, sugerencias, recomendaciones e indicadores si los hay. La planilla FORMATO_15_EMPRESAS_RETO.xlsx siempre al día antes de esa llamada.</w:t>
+            </w:r>
+          </w:p>
+          <w:p>
+            <w:pPr>
+              <w:spacing w:after="20"/>
+            </w:pPr>
+            <w:r>
+              <w:rPr>
+                <w:b/>
+                <w:sz w:val="19"/>
+              </w:rPr>
+              <w:t>Este kit es la base.</w:t>
+            </w:r>
+            <w:r>
+              <w:rPr>
+                <w:b w:val="0"/>
+                <w:sz w:val="19"/>
+              </w:rPr>
+              <w:t xml:space="preserve"> Los guiones de reunión y de charla son nuestra sugerencia: tú tienes la experiencia y los adaptas. Lo que no cambia: qué se ofrece, los precios, lo que no se promete y las reglas.</w:t>
             </w:r>
           </w:p>
         </w:tc>
@@ -150,21 +169,21 @@
       <w:r>
         <w:rPr>
           <w:b w:val="0"/>
-          <w:sz w:val="19"/>
+          <w:sz w:val="18"/>
         </w:rPr>
         <w:t xml:space="preserve">Academia de inglés </w:t>
       </w:r>
       <w:r>
         <w:rPr>
           <w:b/>
-          <w:sz w:val="19"/>
+          <w:sz w:val="18"/>
         </w:rPr>
         <w:t>presencial</w:t>
       </w:r>
       <w:r>
         <w:rPr>
           <w:b w:val="0"/>
-          <w:sz w:val="19"/>
+          <w:sz w:val="18"/>
         </w:rPr>
         <w:t xml:space="preserve"> en Bucaramanga (Carrera 27 # 48-49, barrio Sotomayor, segundo piso). La marca es Heiiu; "Global Teacher S.A.S." solo en documentos legales.</w:t>
       </w:r>
@@ -177,21 +196,21 @@
       <w:r>
         <w:rPr>
           <w:b w:val="0"/>
-          <w:sz w:val="19"/>
+          <w:sz w:val="18"/>
         </w:rPr>
         <w:t xml:space="preserve">Institución de educación para el trabajo y el desarrollo humano </w:t>
       </w:r>
       <w:r>
         <w:rPr>
           <w:b/>
-          <w:sz w:val="19"/>
+          <w:sz w:val="18"/>
         </w:rPr>
         <w:t>con licencia desde 2012</w:t>
       </w:r>
       <w:r>
         <w:rPr>
           <w:b w:val="0"/>
-          <w:sz w:val="19"/>
+          <w:sz w:val="18"/>
         </w:rPr>
         <w:t>; programas registrados ante la Secretaría de Educación (Resoluciones 1581-1131 y 2253-2025).</w:t>
       </w:r>
@@ -204,14 +223,14 @@
       <w:r>
         <w:rPr>
           <w:b/>
-          <w:sz w:val="19"/>
+          <w:sz w:val="18"/>
         </w:rPr>
         <w:t>Triple certificación de calidad ICONTEC</w:t>
       </w:r>
       <w:r>
         <w:rPr>
           <w:b w:val="0"/>
-          <w:sz w:val="19"/>
+          <w:sz w:val="18"/>
         </w:rPr>
         <w:t xml:space="preserve"> (NTC 5555, NTC 5580 e ISO 9001). Es una certificación, no una exclusividad.</w:t>
       </w:r>
@@ -224,48 +243,28 @@
       <w:r>
         <w:rPr>
           <w:b/>
-          <w:sz w:val="19"/>
-        </w:rPr>
-        <w:t>Garantía de aprendizaje por escrito</w:t>
-      </w:r>
-      <w:r>
-        <w:rPr>
-          <w:b w:val="0"/>
-          <w:sz w:val="19"/>
-        </w:rPr>
-        <w:t>, texto único: "Si cumples — asistencia, tareas, evaluaciones — y no avanzas, te devolvemos el 100% del nivel. Por escrito, en el contrato." Es lo único que se dice como "la única academia PRESENCIAL de Bucaramanga".</w:t>
-      </w:r>
-    </w:p>
-    <w:p>
-      <w:pPr>
-        <w:pStyle w:val="ListBullet"/>
-        <w:spacing w:after="0"/>
-      </w:pPr>
-      <w:r>
-        <w:rPr>
-          <w:b/>
-          <w:sz w:val="19"/>
+          <w:sz w:val="18"/>
         </w:rPr>
         <w:t>Niveles:</w:t>
       </w:r>
       <w:r>
         <w:rPr>
           <w:b w:val="0"/>
-          <w:sz w:val="19"/>
+          <w:sz w:val="18"/>
         </w:rPr>
         <w:t xml:space="preserve"> A1 (90 h) · A2 (110 h) · B1 (175 h) · B2 (200 h). Programa completo A1 a B2 = </w:t>
       </w:r>
       <w:r>
         <w:rPr>
           <w:b/>
-          <w:sz w:val="19"/>
+          <w:sz w:val="18"/>
         </w:rPr>
         <w:t>575 horas</w:t>
       </w:r>
       <w:r>
         <w:rPr>
           <w:b w:val="0"/>
-          <w:sz w:val="19"/>
+          <w:sz w:val="18"/>
         </w:rPr>
         <w:t xml:space="preserve"> presenciales. Certificado oficial por cada nivel aprobado y factura al matricularse.</w:t>
       </w:r>
@@ -278,16 +277,16 @@
       <w:r>
         <w:rPr>
           <w:b/>
-          <w:sz w:val="19"/>
+          <w:sz w:val="18"/>
         </w:rPr>
         <w:t>Próximo grupo (confirmado por gerencia):</w:t>
       </w:r>
       <w:r>
         <w:rPr>
           <w:b w:val="0"/>
-          <w:sz w:val="19"/>
+          <w:sz w:val="18"/>
         </w:rPr>
-        <w:t xml:space="preserve"> abre el martes 3 de noviembre. Jornada de mañana, tarde o noche, de 2 o de 4 horas diarias: el horario lo definen los primeros que se matriculen; una empresa con 8 cupos o más define su propio horario. Para entrar el 3 de noviembre, la inicial tiene que estar pagada antes de esa fecha. Sábados de 8:00 a 12:00, un nivel a la vez.</w:t>
+        <w:t xml:space="preserve"> abre el martes 3 de noviembre. Jornada de mañana, tarde o noche, de 2 o de 4 horas diarias: el horario lo definen los primeros que se matriculen; una empresa con 8 cupos o más define su propio horario. Para entrar el 3 de noviembre, el pago tiene que estar hecho antes de esa fecha. Sábados de 8:00 a 12:00, un nivel a la vez.</w:t>
       </w:r>
     </w:p>
     <w:p>
@@ -298,16 +297,16 @@
       <w:r>
         <w:rPr>
           <w:b/>
-          <w:sz w:val="19"/>
+          <w:sz w:val="18"/>
         </w:rPr>
         <w:t>Cómo son las clases:</w:t>
       </w:r>
       <w:r>
         <w:rPr>
           <w:b w:val="0"/>
-          <w:sz w:val="19"/>
+          <w:sz w:val="18"/>
         </w:rPr>
-        <w:t xml:space="preserve"> presenciales, en grupos de máximo 16, con método activo y práctico; video corto diario en inglés que el profesor revisa; una virtud por bloque.</w:t>
+        <w:t xml:space="preserve"> presenciales, en grupos de máximo 16, con método activo y práctico; video corto diario en inglés que el profesor revisa; una virtud por bloque (sección 2).</w:t>
       </w:r>
     </w:p>
     <w:p>
@@ -318,14 +317,54 @@
       <w:r>
         <w:rPr>
           <w:b/>
-          <w:sz w:val="19"/>
+          <w:sz w:val="18"/>
+        </w:rPr>
+        <w:t>El programa exige trabajo fuera de clase:</w:t>
+      </w:r>
+      <w:r>
+        <w:rPr>
+          <w:b w:val="0"/>
+          <w:sz w:val="18"/>
+        </w:rPr>
+        <w:t xml:space="preserve"> el video diario, escuchar podcasts en inglés y tareas cortas. Se dice antes de que firme.</w:t>
+      </w:r>
+    </w:p>
+    <w:p>
+      <w:pPr>
+        <w:pStyle w:val="ListBullet"/>
+        <w:spacing w:after="0"/>
+      </w:pPr>
+      <w:r>
+        <w:rPr>
+          <w:b/>
+          <w:sz w:val="18"/>
+        </w:rPr>
+        <w:t>Edades:</w:t>
+      </w:r>
+      <w:r>
+        <w:rPr>
+          <w:b w:val="0"/>
+          <w:sz w:val="18"/>
+        </w:rPr>
+        <w:t xml:space="preserve"> no vendemos a menores de 12 años. De 12 a 17, por lo general solo el sabatino; entre semana solo si el joven y el acudiente se comprometen al trabajo diario fuera de clase. El acudiente firma.</w:t>
+      </w:r>
+    </w:p>
+    <w:p>
+      <w:pPr>
+        <w:pStyle w:val="ListBullet"/>
+        <w:spacing w:after="0"/>
+      </w:pPr>
+      <w:r>
+        <w:rPr>
+          <w:b/>
+          <w:sz w:val="18"/>
         </w:rPr>
         <w:t>Convenio con Cajasan</w:t>
       </w:r>
       <w:r>
         <w:rPr>
           <w:b w:val="0"/>
-          <w:sz w:val="19"/>
+          <w:sz w:val="18"/>
         </w:rPr>
         <w:t xml:space="preserve"> (no exclusivo): el afiliado entra a la columna más alta del Fondo de Becas. Nunca "los únicos con Cajasan".</w:t>
       </w:r>
@@ -338,82 +377,14 @@
       <w:r>
         <w:rPr>
           <w:b/>
-          <w:sz w:val="19"/>
-        </w:rPr>
-        <w:t>Módulo de Graduación</w:t>
-      </w:r>
-      <w:r>
-        <w:rPr>
-          <w:b w:val="0"/>
-          <w:sz w:val="19"/>
-        </w:rPr>
-        <w:t xml:space="preserve"> (al terminar A2, incluido en el Arranque y en el completo), a elección: </w:t>
-      </w:r>
-      <w:r>
-        <w:rPr>
-          <w:b/>
-          <w:sz w:val="19"/>
-        </w:rPr>
-        <w:t>Emprendedor</w:t>
-      </w:r>
-      <w:r>
-        <w:rPr>
-          <w:b w:val="0"/>
-          <w:sz w:val="19"/>
-        </w:rPr>
-        <w:t xml:space="preserve">, sale con su página web publicada en inglés, su pitch y su primer mensaje de venta a un cliente real; o </w:t>
-      </w:r>
-      <w:r>
-        <w:rPr>
-          <w:b/>
-          <w:sz w:val="19"/>
-        </w:rPr>
-        <w:t>Pasaporte</w:t>
-      </w:r>
-      <w:r>
-        <w:rPr>
-          <w:b w:val="0"/>
-          <w:sz w:val="19"/>
-        </w:rPr>
-        <w:t>, sale con el video de presentación, la hoja de vida en inglés, la entrevista ensayada y la postulación al exterior lista. Con el completo, además, Refuerzo PRO al final de B2. Se describen, nunca se promete un resultado. Dilo en toda charla: es lo que diferencia el programa de un curso.</w:t>
-      </w:r>
-    </w:p>
-    <w:p>
-      <w:pPr>
-        <w:pStyle w:val="ListBullet"/>
-        <w:spacing w:after="0"/>
-      </w:pPr>
-      <w:r>
-        <w:rPr>
-          <w:b/>
-          <w:sz w:val="19"/>
-        </w:rPr>
-        <w:t>La garantía, condiciones que el estudiante firma:</w:t>
-      </w:r>
-      <w:r>
-        <w:rPr>
-          <w:b w:val="0"/>
-          <w:sz w:val="19"/>
-        </w:rPr>
-        <w:t xml:space="preserve"> asistencia (hasta 20% de faltas por nivel; con incapacidad médica no cuentan), tareas al 90% (el video diario se graba en casa) y todas las evaluaciones. Si falta, recupera hasta dos clases al mes en el taller de los sábados. Tres llegadas tarde de más de 15 minutos suman una falta. Retracto: 5 días hábiles por ley; después no hay devolución por retiro, solo por garantía. Dilo antes de que firme, no después.</w:t>
-      </w:r>
-    </w:p>
-    <w:p>
-      <w:pPr>
-        <w:pStyle w:val="ListBullet"/>
-        <w:spacing w:after="0"/>
-      </w:pPr>
-      <w:r>
-        <w:rPr>
-          <w:b/>
-          <w:sz w:val="19"/>
+          <w:sz w:val="18"/>
         </w:rPr>
         <w:t>Nuestra causa</w:t>
       </w:r>
       <w:r>
         <w:rPr>
           <w:b w:val="0"/>
-          <w:sz w:val="19"/>
+          <w:sz w:val="18"/>
         </w:rPr>
         <w:t xml:space="preserve"> (para la reunión con el dueño o gerente): educativa, formar a jóvenes y trabajadores de Santander a través del inglés con valores y disciplina; empresarial, las empresas locales pueden ganar con calidad, resultados que se pueden mostrar y garantía por escrito.</w:t>
       </w:r>
@@ -429,7 +400,259 @@
           <w:color w:val="E54C09"/>
           <w:sz w:val="25"/>
         </w:rPr>
-        <w:t>2. El Pacto y la proyección por motivo</w:t>
+        <w:t>2. Lo que nos diferencia (esto es lo que vendes)</w:t>
+      </w:r>
+    </w:p>
+    <w:tbl>
+      <w:tblPr>
+        <w:tblStyle w:val="TableGrid"/>
+        <w:tblW w:type="auto" w:w="0"/>
+        <w:tblLook w:firstColumn="1" w:firstRow="1" w:lastColumn="0" w:lastRow="0" w:noHBand="0" w:noVBand="1" w:val="04A0"/>
+      </w:tblPr>
+      <w:tblGrid>
+        <w:gridCol w:w="5270"/>
+        <w:gridCol w:w="5270"/>
+      </w:tblGrid>
+      <w:tr>
+        <w:tc>
+          <w:tcPr>
+            <w:tcW w:type="dxa" w:w="2041"/>
+            <w:shd w:val="clear" w:color="auto" w:fill="E54C09"/>
+          </w:tcPr>
+          <w:p>
+            <w:pPr>
+              <w:spacing w:after="0"/>
+            </w:pPr>
+            <w:r>
+              <w:rPr>
+                <w:b/>
+                <w:color w:val="FFFFFF"/>
+                <w:sz w:val="17"/>
+              </w:rPr>
+              <w:t>Diferencia</w:t>
+            </w:r>
+          </w:p>
+        </w:tc>
+        <w:tc>
+          <w:tcPr>
+            <w:tcW w:type="dxa" w:w="8164"/>
+            <w:shd w:val="clear" w:color="auto" w:fill="E54C09"/>
+          </w:tcPr>
+          <w:p>
+            <w:pPr>
+              <w:spacing w:after="0"/>
+            </w:pPr>
+            <w:r>
+              <w:rPr>
+                <w:b/>
+                <w:color w:val="FFFFFF"/>
+                <w:sz w:val="17"/>
+              </w:rPr>
+              <w:t>Qué es y cómo se dice</w:t>
+            </w:r>
+          </w:p>
+        </w:tc>
+      </w:tr>
+      <w:tr>
+        <w:tc>
+          <w:tcPr>
+            <w:tcW w:type="dxa" w:w="2041"/>
+          </w:tcPr>
+          <w:p>
+            <w:pPr>
+              <w:spacing w:after="0"/>
+            </w:pPr>
+            <w:r>
+              <w:rPr>
+                <w:b/>
+                <w:sz w:val="17"/>
+              </w:rPr>
+              <w:t>Garantía de aprendizaje por escrito</w:t>
+            </w:r>
+          </w:p>
+        </w:tc>
+        <w:tc>
+          <w:tcPr>
+            <w:tcW w:type="dxa" w:w="8164"/>
+          </w:tcPr>
+          <w:p>
+            <w:pPr>
+              <w:spacing w:after="0"/>
+            </w:pPr>
+            <w:r>
+              <w:rPr>
+                <w:b w:val="0"/>
+                <w:sz w:val="17"/>
+              </w:rPr>
+              <w:t>Texto único: "Si cumples — asistencia, tareas, evaluaciones — y no avanzas, te devolvemos el 100% del nivel. Por escrito, en el contrato." Es lo único que se dice como "la única academia PRESENCIAL de Bucaramanga". Condiciones que el estudiante firma: asistencia (hasta 20% de faltas por nivel; con incapacidad médica no cuentan), tareas al 90% y todas las evaluaciones. Si falta, recupera hasta dos clases al mes en el taller de los sábados. Tres llegadas tarde de más de 15 minutos suman una falta. Retracto: 5 días hábiles por ley; después no hay devolución por retiro, solo por garantía.</w:t>
+            </w:r>
+          </w:p>
+        </w:tc>
+      </w:tr>
+      <w:tr>
+        <w:tc>
+          <w:tcPr>
+            <w:tcW w:type="dxa" w:w="2041"/>
+          </w:tcPr>
+          <w:p>
+            <w:pPr>
+              <w:spacing w:after="0"/>
+            </w:pPr>
+            <w:r>
+              <w:rPr>
+                <w:b/>
+                <w:sz w:val="17"/>
+              </w:rPr>
+              <w:t>Mentor, entrenamiento y grupo selectivo</w:t>
+            </w:r>
+          </w:p>
+        </w:tc>
+        <w:tc>
+          <w:tcPr>
+            <w:tcW w:type="dxa" w:w="8164"/>
+          </w:tcPr>
+          <w:p>
+            <w:pPr>
+              <w:spacing w:after="0"/>
+            </w:pPr>
+            <w:r>
+              <w:rPr>
+                <w:b w:val="0"/>
+                <w:sz w:val="17"/>
+              </w:rPr>
+              <w:t>Aquí el profesor no dicta: entrena. Es tu mentor: te corrige, te pide cuentas y no te suelta; revisa tu video diario y te lo devuelve con una mejora. Y el grupo es selectivo por El Pacto (sección 3): entra quien acepta entrenar así. Por eso el resultado se puede garantizar.</w:t>
+            </w:r>
+          </w:p>
+        </w:tc>
+      </w:tr>
+      <w:tr>
+        <w:tc>
+          <w:tcPr>
+            <w:tcW w:type="dxa" w:w="2041"/>
+          </w:tcPr>
+          <w:p>
+            <w:pPr>
+              <w:spacing w:after="0"/>
+            </w:pPr>
+            <w:r>
+              <w:rPr>
+                <w:b/>
+                <w:sz w:val="17"/>
+              </w:rPr>
+              <w:t>Módulo de Graduación</w:t>
+            </w:r>
+          </w:p>
+        </w:tc>
+        <w:tc>
+          <w:tcPr>
+            <w:tcW w:type="dxa" w:w="8164"/>
+          </w:tcPr>
+          <w:p>
+            <w:pPr>
+              <w:spacing w:after="0"/>
+            </w:pPr>
+            <w:r>
+              <w:rPr>
+                <w:b w:val="0"/>
+                <w:sz w:val="17"/>
+              </w:rPr>
+              <w:t xml:space="preserve">Al terminar A2 (incluido en el Arranque y en el completo), a elección. </w:t>
+            </w:r>
+            <w:r>
+              <w:rPr>
+                <w:b/>
+                <w:sz w:val="17"/>
+              </w:rPr>
+              <w:t>Emprendedor:</w:t>
+            </w:r>
+            <w:r>
+              <w:rPr>
+                <w:b w:val="0"/>
+                <w:sz w:val="17"/>
+              </w:rPr>
+              <w:t xml:space="preserve"> sale con su página web publicada en inglés, su pitch y su primer mensaje de venta a un cliente real. </w:t>
+            </w:r>
+            <w:r>
+              <w:rPr>
+                <w:b/>
+                <w:sz w:val="17"/>
+              </w:rPr>
+              <w:t>Pasaporte:</w:t>
+            </w:r>
+            <w:r>
+              <w:rPr>
+                <w:b w:val="0"/>
+                <w:sz w:val="17"/>
+              </w:rPr>
+              <w:t xml:space="preserve"> sale con el video de presentación, la hoja de vida en inglés, la entrevista ensayada y la postulación al exterior lista. Con el completo, además, Refuerzo PRO al final de B2. Se describen, nunca se promete un resultado. Dilo en toda charla: es lo que diferencia el programa de un curso.</w:t>
+            </w:r>
+          </w:p>
+        </w:tc>
+      </w:tr>
+      <w:tr>
+        <w:tc>
+          <w:tcPr>
+            <w:tcW w:type="dxa" w:w="2041"/>
+          </w:tcPr>
+          <w:p>
+            <w:pPr>
+              <w:spacing w:after="0"/>
+            </w:pPr>
+            <w:r>
+              <w:rPr>
+                <w:b/>
+                <w:sz w:val="17"/>
+              </w:rPr>
+              <w:t>Virtudes</w:t>
+            </w:r>
+          </w:p>
+        </w:tc>
+        <w:tc>
+          <w:tcPr>
+            <w:tcW w:type="dxa" w:w="8164"/>
+          </w:tcPr>
+          <w:p>
+            <w:pPr>
+              <w:spacing w:after="0"/>
+            </w:pPr>
+            <w:r>
+              <w:rPr>
+                <w:b w:val="0"/>
+                <w:sz w:val="17"/>
+              </w:rPr>
+              <w:t>Cada bloque de clases trabaja una de cuatro virtudes: prudencia (pensar y planear), fortaleza (iniciativa, hablar en público, asertividad), templanza (disciplina, manejo del tiempo, paciencia) y justicia (trabajo en equipo, liderazgo, empatía). Se practica con un ritual corto al inicio de cada clase, en inglés. Cómo decirlo: "Aquí no solo sale hablando inglés: sale con más disciplina y más seguridad para hablar en público. Las empresas lo notan."</w:t>
+            </w:r>
+          </w:p>
+        </w:tc>
+      </w:tr>
+    </w:tbl>
+    <w:p>
+      <w:pPr>
+        <w:spacing w:after="0" w:line="60" w:lineRule="exact"/>
+      </w:pPr>
+      <w:r>
+        <w:rPr>
+          <w:sz w:val="2"/>
+        </w:rPr>
+      </w:r>
+    </w:p>
+    <w:p>
+      <w:r>
+        <w:br w:type="page"/>
+      </w:r>
+    </w:p>
+    <w:p>
+      <w:pPr>
+        <w:keepNext/>
+        <w:spacing w:before="140" w:after="40"/>
+      </w:pPr>
+      <w:r>
+        <w:rPr>
+          <w:b/>
+          <w:color w:val="E54C09"/>
+          <w:sz w:val="25"/>
+        </w:rPr>
+        <w:t>3. El Pacto y la proyección por motivo</w:t>
       </w:r>
     </w:p>
     <w:p>
@@ -486,7 +709,7 @@
                 <w:i/>
                 <w:sz w:val="19"/>
               </w:rPr>
-              <w:t>"Antes de contarte precios, te cuento cómo es esto, para que decidas con todo claro. Nuestro objetivo es que salgas hablando inglés; si no se logra, algo está mal: o tú dejaste de entrenar, o nosotros no estamos cumpliendo. Esto es un entrenamiento en equipo, como un gimnasio o aprender a nadar: desde el primer día hablas, tu profesor identifica dónde puedes mejorar y lo repetimos hasta que sale. Por eso grabas un video corto todos los días, y tu profesor te lo devuelve con una mejora. A cambio, la garantía por escrito: si cumples tu parte y no avanzas, te devolvemos el 100% del nivel. ¿Te le mides a ese ritmo?"</w:t>
+              <w:t>"Antes de contarte precios, te cuento cómo es esto, para que decidas con todo claro. Nuestro objetivo es que salgas hablando inglés; si no se logra, algo está mal: o tú dejaste de entrenar, o nosotros no estamos cumpliendo. Esto es un entrenamiento en equipo, como un gimnasio o aprender a nadar: desde el primer día practicas, tu profesor identifica dónde puedes mejorar y lo repetimos hasta que sale. Por eso grabas un video corto todos los días, escuchas podcasts en inglés y haces tareas cortas, y tu profesor te devuelve el video con una mejora. A cambio, la garantía por escrito: si cumples tu parte y no avanzas, te devolvemos el 100% del nivel. ¿Te le mides a ese ritmo?"</w:t>
             </w:r>
           </w:p>
         </w:tc>
@@ -510,7 +733,6 @@
         <w:rPr>
           <w:b w:val="0"/>
           <w:i w:val="0"/>
-          <w:color w:val="666666"/>
           <w:sz w:val="18"/>
         </w:rPr>
         <w:t>Si dice "busco algo más suave": "Te agradezco la sinceridad. Este programa es exigente a propósito, y prefiero decírtelo ahora a que lo descubras en la segunda semana." Fin, sin reintentos. Jamás: fácil, rápido, divertido, "en tres meses hablas", nativos, empleo, visa.</w:t>
@@ -688,7 +910,7 @@
                 <w:b/>
                 <w:sz w:val="17"/>
               </w:rPr>
-              <w:t>Su hijo o hija</w:t>
+              <w:t>Montar un negocio</w:t>
             </w:r>
           </w:p>
         </w:tc>
@@ -705,7 +927,43 @@
                 <w:b w:val="0"/>
                 <w:sz w:val="17"/>
               </w:rPr>
-              <w:t>"Imagínate a tu hijo a los 18 con el inglés resuelto: la universidad o la beca sin ese requisito pendiente, o su primer trabajo cobrando más. Y lo que los papás más nos agradecen: aquí se entrena disciplina y constancia." Desde 12 años en cualquier jornada; el acudiente va a la cita y firma.</w:t>
+              <w:t>"Tu negocio con una página en inglés publicada y un cliente de afuera que te escribe y le respondes sin traductor. Con eso sales del módulo Emprendedor."</w:t>
+            </w:r>
+          </w:p>
+        </w:tc>
+      </w:tr>
+      <w:tr>
+        <w:tc>
+          <w:tcPr>
+            <w:tcW w:type="dxa" w:w="1814"/>
+          </w:tcPr>
+          <w:p>
+            <w:pPr>
+              <w:spacing w:after="0"/>
+            </w:pPr>
+            <w:r>
+              <w:rPr>
+                <w:b/>
+                <w:sz w:val="17"/>
+              </w:rPr>
+              <w:t>Su hijo o hija (12 a 17)</w:t>
+            </w:r>
+          </w:p>
+        </w:tc>
+        <w:tc>
+          <w:tcPr>
+            <w:tcW w:type="dxa" w:w="8391"/>
+          </w:tcPr>
+          <w:p>
+            <w:pPr>
+              <w:spacing w:after="0"/>
+            </w:pPr>
+            <w:r>
+              <w:rPr>
+                <w:b w:val="0"/>
+                <w:sz w:val="17"/>
+              </w:rPr>
+              <w:t>"Imagínate a tu hijo a los 18 con el inglés resuelto: la universidad o la beca sin ese requisito pendiente, o su primer trabajo cobrando más. Y lo que los papás más nos agradecen: aquí se entrena disciplina y constancia." Por lo general el sabatino; entre semana solo con compromiso de trabajo diario. Menores de 12: no.</w:t>
             </w:r>
           </w:p>
         </w:tc>
@@ -732,36 +990,7 @@
           <w:color w:val="E54C09"/>
           <w:sz w:val="25"/>
         </w:rPr>
-        <w:t>3. Mensaje de contacto al dueño o gerente</w:t>
-      </w:r>
-    </w:p>
-    <w:p>
-      <w:pPr>
-        <w:spacing w:after="40"/>
-      </w:pPr>
-      <w:r>
-        <w:rPr>
-          <w:b w:val="0"/>
-          <w:i w:val="0"/>
-          <w:sz w:val="19"/>
-        </w:rPr>
-        <w:t xml:space="preserve">Un solo pedido: </w:t>
-      </w:r>
-      <w:r>
-        <w:rPr>
-          <w:b/>
-          <w:i w:val="0"/>
-          <w:sz w:val="19"/>
-        </w:rPr>
-        <w:t>15 minutos de reunión y una charla de 20 minutos con su gente.</w:t>
-      </w:r>
-      <w:r>
-        <w:rPr>
-          <w:b w:val="0"/>
-          <w:i w:val="0"/>
-          <w:sz w:val="19"/>
-        </w:rPr>
-        <w:t xml:space="preserve"> Nada de precios en el mensaje. Empresas de 40 a 150 empleados donde el dueño o el gerente decide; registra la empresa en la planilla antes de escribir.</w:t>
+        <w:t>4. Qué se ve en cada nivel y los dos caminos</w:t>
       </w:r>
     </w:p>
     <w:tbl>
@@ -777,7 +1006,7 @@
       <w:tr>
         <w:tc>
           <w:tcPr>
-            <w:tcW w:type="dxa" w:w="1814"/>
+            <w:tcW w:type="dxa" w:w="1474"/>
             <w:shd w:val="clear" w:color="auto" w:fill="E54C09"/>
           </w:tcPr>
           <w:p>
@@ -790,13 +1019,13 @@
                 <w:color w:val="FFFFFF"/>
                 <w:sz w:val="17"/>
               </w:rPr>
-              <w:t>Versión</w:t>
+              <w:t>Nivel</w:t>
             </w:r>
           </w:p>
         </w:tc>
         <w:tc>
           <w:tcPr>
-            <w:tcW w:type="dxa" w:w="8391"/>
+            <w:tcW w:type="dxa" w:w="8731"/>
             <w:shd w:val="clear" w:color="auto" w:fill="E54C09"/>
           </w:tcPr>
           <w:p>
@@ -809,7 +1038,7 @@
                 <w:color w:val="FFFFFF"/>
                 <w:sz w:val="17"/>
               </w:rPr>
-              <w:t>Texto (cambia lo que está entre corchetes)</w:t>
+              <w:t>En lenguaje de la vida real</w:t>
             </w:r>
           </w:p>
         </w:tc>
@@ -817,7 +1046,7 @@
       <w:tr>
         <w:tc>
           <w:tcPr>
-            <w:tcW w:type="dxa" w:w="1814"/>
+            <w:tcW w:type="dxa" w:w="1474"/>
           </w:tcPr>
           <w:p>
             <w:pPr>
@@ -828,13 +1057,13 @@
                 <w:b/>
                 <w:sz w:val="17"/>
               </w:rPr>
-              <w:t>WhatsApp en frío</w:t>
+              <w:t>A1 (90 h)</w:t>
             </w:r>
           </w:p>
         </w:tc>
         <w:tc>
           <w:tcPr>
-            <w:tcW w:type="dxa" w:w="8391"/>
+            <w:tcW w:type="dxa" w:w="8731"/>
           </w:tcPr>
           <w:p>
             <w:pPr>
@@ -845,7 +1074,7 @@
                 <w:b w:val="0"/>
                 <w:sz w:val="17"/>
               </w:rPr>
-              <w:t>"Buenos días, [nombre]. Soy [tu nombre], ejecutivo de alianzas de Heiiu English Academy, en Bucaramanga: licencia desde 2012 y certificación ICONTEC. Estamos abriendo alianzas con empresas de la ciudad: sin costo para la empresa, sus colaboradores acceden a la beca más alta de nuestro Fondo para formarse en inglés presencial, con garantía de aprendizaje por escrito. Le pido 15 minutos para mostrárselo y, si le sirve, una charla de 20 minutos con su equipo. ¿Le queda mejor el [día] a las [hora] o el [día] a las [hora]?"</w:t>
+              <w:t>Presentarse, números, hora, rutina, familia, profesiones, ciudad; presente, pasado simple, planes. Cierra con la presentación "MY WORLD".</w:t>
             </w:r>
           </w:p>
         </w:tc>
@@ -853,7 +1082,7 @@
       <w:tr>
         <w:tc>
           <w:tcPr>
-            <w:tcW w:type="dxa" w:w="1814"/>
+            <w:tcW w:type="dxa" w:w="1474"/>
           </w:tcPr>
           <w:p>
             <w:pPr>
@@ -864,13 +1093,13 @@
                 <w:b/>
                 <w:sz w:val="17"/>
               </w:rPr>
-              <w:t>LinkedIn</w:t>
+              <w:t>A2 (110 h)</w:t>
             </w:r>
           </w:p>
         </w:tc>
         <w:tc>
           <w:tcPr>
-            <w:tcW w:type="dxa" w:w="8391"/>
+            <w:tcW w:type="dxa" w:w="8731"/>
           </w:tcPr>
           <w:p>
             <w:pPr>
@@ -881,7 +1110,7 @@
                 <w:b w:val="0"/>
                 <w:sz w:val="17"/>
               </w:rPr>
-              <w:t>"[Nombre], le escribo de Heiiu English Academy, academia presencial de Bucaramanga con licencia desde 2012. Abrimos alianzas con empresas que quieren premiar y formar a su gente en inglés sin tocar la nómina: la empresa no paga nada y sus colaboradores entran con la beca más alta de nuestro Fondo, con garantía de aprendizaje por escrito. ¿Me regala 15 minutos esta semana para contarle cómo funciona? Si le sirve, le propongo una charla de 20 minutos con su equipo."</w:t>
+              <w:t>Futuro, condicionales, pasados, presente perfecto; entrevista de trabajo, viajes, hotel, servicio al cliente. Cierra con la presentación "MY LIFE" y el Módulo de Graduación.</w:t>
             </w:r>
           </w:p>
         </w:tc>
@@ -889,7 +1118,7 @@
       <w:tr>
         <w:tc>
           <w:tcPr>
-            <w:tcW w:type="dxa" w:w="1814"/>
+            <w:tcW w:type="dxa" w:w="1474"/>
           </w:tcPr>
           <w:p>
             <w:pPr>
@@ -900,13 +1129,13 @@
                 <w:b/>
                 <w:sz w:val="17"/>
               </w:rPr>
-              <w:t>Referido por un conocido</w:t>
+              <w:t>B1 (175 h)</w:t>
             </w:r>
           </w:p>
         </w:tc>
         <w:tc>
           <w:tcPr>
-            <w:tcW w:type="dxa" w:w="8391"/>
+            <w:tcW w:type="dxa" w:w="8731"/>
           </w:tcPr>
           <w:p>
             <w:pPr>
@@ -917,7 +1146,43 @@
                 <w:b w:val="0"/>
                 <w:sz w:val="17"/>
               </w:rPr>
-              <w:t>"Buenos días, [nombre]. [Nombre de quien lo refiere] me sugirió escribirle. Soy [tu nombre], de Heiiu English Academy. Estamos abriendo alianzas con empresas de Bucaramanga para que sus colaboradores se formen en inglés con la beca más alta de nuestro Fondo, sin costo para la empresa y con garantía por escrito. Le pido 15 minutos para mostrárselo y, si le parece, una charla de 20 minutos con su gente. ¿El [día] a las [hora] o el [día] a las [hora]?"</w:t>
+              <w:t>Gramática en contexto profesional: briefings, entrevistas, onboarding, planeación, negociación. Hitos: "MY STORY, MY GOALS" y presentaciones finales.</w:t>
+            </w:r>
+          </w:p>
+        </w:tc>
+      </w:tr>
+      <w:tr>
+        <w:tc>
+          <w:tcPr>
+            <w:tcW w:type="dxa" w:w="1474"/>
+          </w:tcPr>
+          <w:p>
+            <w:pPr>
+              <w:spacing w:after="0"/>
+            </w:pPr>
+            <w:r>
+              <w:rPr>
+                <w:b/>
+                <w:sz w:val="17"/>
+              </w:rPr>
+              <w:t>B2 (200 h)</w:t>
+            </w:r>
+          </w:p>
+        </w:tc>
+        <w:tc>
+          <w:tcPr>
+            <w:tcW w:type="dxa" w:w="8731"/>
+          </w:tcPr>
+          <w:p>
+            <w:pPr>
+              <w:spacing w:after="0"/>
+            </w:pPr>
+            <w:r>
+              <w:rPr>
+                <w:b w:val="0"/>
+                <w:sz w:val="17"/>
+              </w:rPr>
+              <w:t>Conversacional y profesional: vida real (quejas, médico, banco) y mundo laboral (networking, entrevistas, presentar una idea, negociación, pedir un aumento). Cierra con un simulacro de jornada de trabajo. Con el programa completo: Refuerzo PRO.</w:t>
             </w:r>
           </w:p>
         </w:tc>
@@ -939,10 +1204,178 @@
       </w:pPr>
       <w:r>
         <w:rPr>
+          <w:b/>
+          <w:i w:val="0"/>
+          <w:sz w:val="18"/>
+        </w:rPr>
+        <w:t>Los dos caminos</w:t>
+      </w:r>
+      <w:r>
+        <w:rPr>
+          <w:b w:val="0"/>
+          <w:i w:val="0"/>
+          <w:sz w:val="18"/>
+        </w:rPr>
+        <w:t xml:space="preserve"> (flyer "Dos caminos", en tu carpeta): el Arranque (A1+A2, 200 horas, con Módulo de Graduación) para quien empieza y quiere defenderse; el programa completo (575 horas, garantía y Refuerzo PRO) para quien tiene una meta profesional. Se muestra el flyer, se explica en un minuto y se pregunta: "¿cuál es tu meta?".</w:t>
+      </w:r>
+    </w:p>
+    <w:p>
+      <w:pPr>
+        <w:keepNext/>
+        <w:spacing w:before="140" w:after="40"/>
+      </w:pPr>
+      <w:r>
+        <w:rPr>
+          <w:b/>
+          <w:color w:val="E54C09"/>
+          <w:sz w:val="25"/>
+        </w:rPr>
+        <w:t>5. El mensaje al dueño o gerente: lo escribes tú</w:t>
+      </w:r>
+    </w:p>
+    <w:p>
+      <w:pPr>
+        <w:spacing w:after="20"/>
+      </w:pPr>
+      <w:r>
+        <w:rPr>
+          <w:b w:val="0"/>
+          <w:i w:val="0"/>
+          <w:sz w:val="20"/>
+        </w:rPr>
+        <w:t>Tú sabes cómo se le escribe a un gerente; el texto es tuyo. Antes de mandarlo, léelo como si fueras el gerente: si tú no le contestarías, no lo mandes. Lo que sí tiene que cumplir:</w:t>
+      </w:r>
+    </w:p>
+    <w:p>
+      <w:pPr>
+        <w:pStyle w:val="ListBullet"/>
+        <w:spacing w:after="0"/>
+      </w:pPr>
+      <w:r>
+        <w:rPr>
+          <w:b/>
+          <w:sz w:val="18"/>
+        </w:rPr>
+        <w:t>Un solo pedido:</w:t>
+      </w:r>
+      <w:r>
+        <w:rPr>
+          <w:b w:val="0"/>
+          <w:sz w:val="18"/>
+        </w:rPr>
+        <w:t xml:space="preserve"> 15 minutos con él. La charla con su gente se pide en la reunión, no en el mensaje.</w:t>
+      </w:r>
+    </w:p>
+    <w:p>
+      <w:pPr>
+        <w:pStyle w:val="ListBullet"/>
+        <w:spacing w:after="0"/>
+      </w:pPr>
+      <w:r>
+        <w:rPr>
+          <w:b/>
+          <w:sz w:val="18"/>
+        </w:rPr>
+        <w:t>No abre con "academia de inglés" ni con que alguien paga.</w:t>
+      </w:r>
+      <w:r>
+        <w:rPr>
+          <w:b w:val="0"/>
+          <w:sz w:val="18"/>
+        </w:rPr>
+        <w:t xml:space="preserve"> Abre con lo que gana él: un beneficio de formación para su gente, con garantía por escrito, y becas con el nombre de su empresa. Lo del inglés se entiende; lo de la plata se explica en la reunión.</w:t>
+      </w:r>
+    </w:p>
+    <w:p>
+      <w:pPr>
+        <w:pStyle w:val="ListBullet"/>
+        <w:spacing w:after="0"/>
+      </w:pPr>
+      <w:r>
+        <w:rPr>
+          <w:b/>
+          <w:sz w:val="18"/>
+        </w:rPr>
+        <w:t>Nada de precios, descuentos ni "gratis".</w:t>
+      </w:r>
+      <w:r>
+        <w:rPr>
+          <w:b w:val="0"/>
+          <w:sz w:val="18"/>
+        </w:rPr>
+        <w:t xml:space="preserve"> Si menciona el costo para la empresa, la frase es "sin costo para la empresa", nunca "sin costo de nómina".</w:t>
+      </w:r>
+    </w:p>
+    <w:p>
+      <w:pPr>
+        <w:pStyle w:val="ListBullet"/>
+        <w:spacing w:after="0"/>
+      </w:pPr>
+      <w:r>
+        <w:rPr>
+          <w:b/>
+          <w:sz w:val="18"/>
+        </w:rPr>
+        <w:t>Una frase de respaldo:</w:t>
+      </w:r>
+      <w:r>
+        <w:rPr>
+          <w:b w:val="0"/>
+          <w:sz w:val="18"/>
+        </w:rPr>
+        <w:t xml:space="preserve"> licencia desde 2012, certificación ICONTEC, garantía por escrito. Una, no las tres seguidas.</w:t>
+      </w:r>
+    </w:p>
+    <w:p>
+      <w:pPr>
+        <w:pStyle w:val="ListBullet"/>
+        <w:spacing w:after="0"/>
+      </w:pPr>
+      <w:r>
+        <w:rPr>
+          <w:b/>
+          <w:sz w:val="18"/>
+        </w:rPr>
+        <w:t>Cierra con dos opciones de día y hora.</w:t>
+      </w:r>
+      <w:r>
+        <w:rPr>
+          <w:b w:val="0"/>
+          <w:sz w:val="18"/>
+        </w:rPr>
+        <w:t xml:space="preserve"> No con "¿cuándo le queda bien?".</w:t>
+      </w:r>
+    </w:p>
+    <w:p>
+      <w:pPr>
+        <w:pStyle w:val="ListBullet"/>
+        <w:spacing w:after="0"/>
+      </w:pPr>
+      <w:r>
+        <w:rPr>
+          <w:b/>
+          <w:sz w:val="18"/>
+        </w:rPr>
+        <w:t>Empresas:</w:t>
+      </w:r>
+      <w:r>
+        <w:rPr>
+          <w:b w:val="0"/>
+          <w:sz w:val="18"/>
+        </w:rPr>
+        <w:t xml:space="preserve"> de 40 a 150 empleados donde el dueño o el gerente decide. Registra la empresa en la planilla antes de escribir.</w:t>
+      </w:r>
+    </w:p>
+    <w:p>
+      <w:pPr>
+        <w:spacing w:after="40"/>
+      </w:pPr>
+      <w:r>
+        <w:rPr>
           <w:b w:val="0"/>
           <w:i w:val="0"/>
           <w:color w:val="666666"/>
-          <w:sz w:val="18"/>
+          <w:sz w:val="17"/>
         </w:rPr>
         <w:t>Horario de contacto por iniciativa tuya: lunes a viernes de 7:00 a. m. a 7:00 p. m. y sábados de 8:00 a. m. a 3:00 p. m.; nunca domingos ni festivos; máximo un contacto al día por persona.</w:t>
       </w:r>
@@ -958,7 +1391,20 @@
           <w:color w:val="E54C09"/>
           <w:sz w:val="25"/>
         </w:rPr>
-        <w:t>4. Reunión con el decisor: 10 minutos, 6 pasos</w:t>
+        <w:t>6. Reunión con el decisor: nuestra sugerencia (10 minutos)</w:t>
+      </w:r>
+    </w:p>
+    <w:p>
+      <w:pPr>
+        <w:spacing w:after="20"/>
+      </w:pPr>
+      <w:r>
+        <w:rPr>
+          <w:b w:val="0"/>
+          <w:i w:val="0"/>
+          <w:sz w:val="18"/>
+        </w:rPr>
+        <w:t>Tú tienes la experiencia y decides cómo llevarla. Lo que no cambia: el orden de preferencia (primero que la empresa invierta, después la alianza sin costo), qué firma cada modelo y qué no se promete.</w:t>
       </w:r>
     </w:p>
     <w:tbl>
@@ -1115,21 +1561,21 @@
                 <w:b w:val="0"/>
                 <w:sz w:val="17"/>
               </w:rPr>
-              <w:t xml:space="preserve">Un beneficio de bienestar para su gente </w:t>
+              <w:t xml:space="preserve">Un beneficio de formación para su gente </w:t>
             </w:r>
             <w:r>
               <w:rPr>
                 <w:b/>
                 <w:sz w:val="17"/>
               </w:rPr>
-              <w:t>sin costo de nómina</w:t>
+              <w:t>sin costo para la empresa</w:t>
             </w:r>
             <w:r>
               <w:rPr>
                 <w:b w:val="0"/>
                 <w:sz w:val="17"/>
               </w:rPr>
-              <w:t>; Becas con el nombre de su empresa (3 por trimestre, suben a 5 si todos sus becados cumplen) con certificado a su nombre; reporte periódico de asistencia y cumplimiento de sus becados (nunca notas); diagnóstico de nivel de inglés hasta 10 personas, sin costo.</w:t>
+              <w:t xml:space="preserve"> (o con inversión, si quiere formar a su equipo); Becas con el nombre de su empresa (3 por trimestre, suben a 5 si todos sus becados cumplen) con certificado a su nombre; reporte periódico de asistencia y cumplimiento de sus becados (nunca notas); diagnóstico de nivel de inglés hasta 10 personas, sin costo.</w:t>
             </w:r>
           </w:p>
         </w:tc>
@@ -1146,7 +1592,7 @@
                 <w:b w:val="0"/>
                 <w:sz w:val="17"/>
               </w:rPr>
-              <w:t>Qué le importa más: premiar o formar</w:t>
+              <w:t>Qué le importa más: formar o premiar</w:t>
             </w:r>
           </w:p>
         </w:tc>
@@ -1165,7 +1611,7 @@
                 <w:b/>
                 <w:sz w:val="17"/>
               </w:rPr>
-              <w:t>3. Modelo A o modelo B (3 min)</w:t>
+              <w:t>3. Primero, plan empresa (2 min)</w:t>
             </w:r>
           </w:p>
         </w:tc>
@@ -1182,35 +1628,7 @@
                 <w:b w:val="0"/>
                 <w:sz w:val="17"/>
               </w:rPr>
-              <w:t xml:space="preserve">"Si su empresa quiere premiar a su gente sin tocar presupuesto, firmamos la alianza hoy. Si quiere formar a su equipo, le presento el plan empresa." </w:t>
-            </w:r>
-            <w:r>
-              <w:rPr>
-                <w:b/>
-                <w:sz w:val="17"/>
-              </w:rPr>
-              <w:t>A, alianza sin costo:</w:t>
-            </w:r>
-            <w:r>
-              <w:rPr>
-                <w:b w:val="0"/>
-                <w:sz w:val="17"/>
-              </w:rPr>
-              <w:t xml:space="preserve"> cada colaborador con carta de la empresa paga su programa completo a $4.782.800 de contado (lista: $8.696.000). </w:t>
-            </w:r>
-            <w:r>
-              <w:rPr>
-                <w:b/>
-                <w:sz w:val="17"/>
-              </w:rPr>
-              <w:t>B, plan empresa:</w:t>
-            </w:r>
-            <w:r>
-              <w:rPr>
-                <w:b w:val="0"/>
-                <w:sz w:val="17"/>
-              </w:rPr>
-              <w:t xml:space="preserve"> la empresa paga los cupos: $4.782.800 por cupo de 3 a 7, $4.350.000 de 8 a 15, $3.950.000 de 16 a 30.</w:t>
+              <w:t>"Si quiere formar a su equipo, la empresa paga los cupos: $4.782.800 por cupo de 3 a 7, $4.350.000 de 8 a 15, $3.950.000 de 16 a 30, de contado o con inicial y 3 cuotas. Usted escoge a quién y, con 8 o más, el horario es suyo." Es lo preferido: una decisión, una firma, un grupo.</w:t>
             </w:r>
           </w:p>
         </w:tc>
@@ -1227,7 +1645,7 @@
                 <w:b w:val="0"/>
                 <w:sz w:val="17"/>
               </w:rPr>
-              <w:t>A, B o los dos</w:t>
+              <w:t>Sí / no al plan empresa</w:t>
             </w:r>
           </w:p>
         </w:tc>
@@ -1246,7 +1664,60 @@
                 <w:b/>
                 <w:sz w:val="17"/>
               </w:rPr>
-              <w:t>4. Qué firma (1 min)</w:t>
+              <w:t>4. Si no, alianza sin costo (2 min)</w:t>
+            </w:r>
+          </w:p>
+        </w:tc>
+        <w:tc>
+          <w:tcPr>
+            <w:tcW w:type="dxa" w:w="6576"/>
+          </w:tcPr>
+          <w:p>
+            <w:pPr>
+              <w:spacing w:after="0"/>
+            </w:pPr>
+            <w:r>
+              <w:rPr>
+                <w:b w:val="0"/>
+                <w:sz w:val="17"/>
+              </w:rPr>
+              <w:t>"Si prefiere no tocar presupuesto, firmamos la alianza: a la empresa no le cuesta nada y cada colaborador con su carta entra al programa completo a $4.782.800 de contado (lista $8.696.000) o $5.565.440 en cuotas." Y de una: "Para que sirva, le pido 20 minutos con su gente esta semana. ¿Martes o jueves?" Un convenio sin charla no produce nada: la charla se agenda en la misma reunión, y si talento humano no la mueve, la haces tú esa semana.</w:t>
+            </w:r>
+          </w:p>
+        </w:tc>
+        <w:tc>
+          <w:tcPr>
+            <w:tcW w:type="dxa" w:w="1928"/>
+          </w:tcPr>
+          <w:p>
+            <w:pPr>
+              <w:spacing w:after="0"/>
+            </w:pPr>
+            <w:r>
+              <w:rPr>
+                <w:b w:val="0"/>
+                <w:sz w:val="17"/>
+              </w:rPr>
+              <w:t>Fecha de la charla</w:t>
+            </w:r>
+          </w:p>
+        </w:tc>
+      </w:tr>
+      <w:tr>
+        <w:tc>
+          <w:tcPr>
+            <w:tcW w:type="dxa" w:w="1701"/>
+          </w:tcPr>
+          <w:p>
+            <w:pPr>
+              <w:spacing w:after="0"/>
+            </w:pPr>
+            <w:r>
+              <w:rPr>
+                <w:b/>
+                <w:sz w:val="17"/>
+              </w:rPr>
+              <w:t>5. Qué firma (1 min)</w:t>
             </w:r>
           </w:p>
         </w:tc>
@@ -1263,28 +1734,28 @@
                 <w:b/>
                 <w:sz w:val="17"/>
               </w:rPr>
-              <w:t>A:</w:t>
+              <w:t>Plan empresa:</w:t>
             </w:r>
             <w:r>
               <w:rPr>
                 <w:b w:val="0"/>
                 <w:sz w:val="17"/>
               </w:rPr>
-              <w:t xml:space="preserve"> el Convenio Heiiu Business Partner: 12 meses, sin costo ni obligaciones económicas; la empresa designa un contacto de talento humano, emite las cartas de postulación y difunde el beneficio; no recibe ni gestiona pagos. </w:t>
+              <w:t xml:space="preserve"> la Orden Plan Empresa: elige tramo y forma de pago, designa a los colaboradores antes del inicio; queda en firme con la firma de gerencia y el pago inicial; precios vigentes 30 días. </w:t>
             </w:r>
             <w:r>
               <w:rPr>
                 <w:b/>
                 <w:sz w:val="17"/>
               </w:rPr>
-              <w:t>B:</w:t>
+              <w:t>Alianza:</w:t>
             </w:r>
             <w:r>
               <w:rPr>
                 <w:b w:val="0"/>
                 <w:sz w:val="17"/>
               </w:rPr>
-              <w:t xml:space="preserve"> la Orden Plan Empresa: elige tramo y forma de pago, designa a los colaboradores antes del inicio; queda en firme con la firma del representante legal de Heiiu y el pago inicial; precios vigentes 30 días. Tú no firmas por Heiiu: firma gerencia.</w:t>
+              <w:t xml:space="preserve"> el Convenio Heiiu Business Partner: 12 meses, sin costo ni obligaciones económicas; la empresa designa un contacto, emite las cartas de postulación y difunde el beneficio; no recibe ni gestiona pagos. Tú no firmas por Heiiu: firma gerencia.</w:t>
             </w:r>
           </w:p>
         </w:tc>
@@ -1320,59 +1791,6 @@
                 <w:b/>
                 <w:sz w:val="17"/>
               </w:rPr>
-              <w:t>5. La charla (2 min)</w:t>
-            </w:r>
-          </w:p>
-        </w:tc>
-        <w:tc>
-          <w:tcPr>
-            <w:tcW w:type="dxa" w:w="6576"/>
-          </w:tcPr>
-          <w:p>
-            <w:pPr>
-              <w:spacing w:after="0"/>
-            </w:pPr>
-            <w:r>
-              <w:rPr>
-                <w:b w:val="0"/>
-                <w:sz w:val="17"/>
-              </w:rPr>
-              <w:t>"Para que su gente lo conozca, le pido 20 minutos con ellos, en su sede, en el horario que menos le afecte la operación. Yo la doy; los interesados se inscriben directo con nosotros."</w:t>
-            </w:r>
-          </w:p>
-        </w:tc>
-        <w:tc>
-          <w:tcPr>
-            <w:tcW w:type="dxa" w:w="1928"/>
-          </w:tcPr>
-          <w:p>
-            <w:pPr>
-              <w:spacing w:after="0"/>
-            </w:pPr>
-            <w:r>
-              <w:rPr>
-                <w:b w:val="0"/>
-                <w:sz w:val="17"/>
-              </w:rPr>
-              <w:t>Autorización de la charla</w:t>
-            </w:r>
-          </w:p>
-        </w:tc>
-      </w:tr>
-      <w:tr>
-        <w:tc>
-          <w:tcPr>
-            <w:tcW w:type="dxa" w:w="1701"/>
-          </w:tcPr>
-          <w:p>
-            <w:pPr>
-              <w:spacing w:after="0"/>
-            </w:pPr>
-            <w:r>
-              <w:rPr>
-                <w:b/>
-                <w:sz w:val="17"/>
-              </w:rPr>
               <w:t>6. Cierre con fecha (1 min)</w:t>
             </w:r>
           </w:p>
@@ -1390,7 +1808,7 @@
                 <w:b w:val="0"/>
                 <w:sz w:val="17"/>
               </w:rPr>
-              <w:t>"¿La hacemos el [día] a las [hora] o el [día] a las [hora]?" Y silencio. Toda reunión termina con algo: fecha de charla, convenio u orden firmados, o un referido concreto.</w:t>
+              <w:t>"¿La hacemos el [día] a las [hora] o el [día] a las [hora]?" Y silencio. Toda reunión termina con algo: orden firmada, convenio firmado con fecha de charla, o un referido concreto.</w:t>
             </w:r>
           </w:p>
         </w:tc>
@@ -1407,7 +1825,7 @@
                 <w:b w:val="0"/>
                 <w:sz w:val="17"/>
               </w:rPr>
-              <w:t>Fecha de charla en la planilla</w:t>
+              <w:t>Fecha en la planilla</w:t>
             </w:r>
           </w:p>
         </w:tc>
@@ -1476,6 +1894,25 @@
               <w:t xml:space="preserve"> más de 30 cupos, grupo cerrado en la empresa con horario especial, copago con valores distintos, plazos distintos o cualquier condición que no esté escrita en la orden.</w:t>
             </w:r>
           </w:p>
+          <w:p>
+            <w:pPr>
+              <w:spacing w:after="20"/>
+            </w:pPr>
+            <w:r>
+              <w:rPr>
+                <w:b/>
+                <w:sz w:val="18"/>
+              </w:rPr>
+              <w:t>Si el dueño o gerente quiere inglés para él:</w:t>
+            </w:r>
+            <w:r>
+              <w:rPr>
+                <w:b w:val="0"/>
+                <w:sz w:val="18"/>
+              </w:rPr>
+              <w:t xml:space="preserve"> inglés para empresarios, personalizado, virtual, a su medida: $70.000 la hora, mínimo 30 horas ($2.100.000). Lo agendas con gerencia, que arma el plan con él.</w:t>
+            </w:r>
+          </w:p>
         </w:tc>
       </w:tr>
     </w:tbl>
@@ -1500,7 +1937,20 @@
           <w:color w:val="E54C09"/>
           <w:sz w:val="25"/>
         </w:rPr>
-        <w:t>5. La charla de 20 minutos a los empleados</w:t>
+        <w:t>7. La charla de 20 minutos a los empleados: nuestra sugerencia</w:t>
+      </w:r>
+    </w:p>
+    <w:p>
+      <w:pPr>
+        <w:spacing w:after="20"/>
+      </w:pPr>
+      <w:r>
+        <w:rPr>
+          <w:b w:val="0"/>
+          <w:i w:val="0"/>
+          <w:sz w:val="18"/>
+        </w:rPr>
+        <w:t>Es el camino cuando la empresa no invierte. Tú la adaptas; lo que no cambia es El Pacto antes de los precios, las opciones y el registro de interesados.</w:t>
       </w:r>
     </w:p>
     <w:tbl>
@@ -1517,7 +1967,7 @@
       <w:tr>
         <w:tc>
           <w:tcPr>
-            <w:tcW w:type="dxa" w:w="794"/>
+            <w:tcW w:type="dxa" w:w="907"/>
             <w:shd w:val="clear" w:color="auto" w:fill="E54C09"/>
           </w:tcPr>
           <w:p>
@@ -1555,7 +2005,7 @@
         </w:tc>
         <w:tc>
           <w:tcPr>
-            <w:tcW w:type="dxa" w:w="7597"/>
+            <w:tcW w:type="dxa" w:w="7483"/>
             <w:shd w:val="clear" w:color="auto" w:fill="E54C09"/>
           </w:tcPr>
           <w:p>
@@ -1576,7 +2026,7 @@
       <w:tr>
         <w:tc>
           <w:tcPr>
-            <w:tcW w:type="dxa" w:w="794"/>
+            <w:tcW w:type="dxa" w:w="907"/>
           </w:tcPr>
           <w:p>
             <w:pPr>
@@ -1610,7 +2060,7 @@
         </w:tc>
         <w:tc>
           <w:tcPr>
-            <w:tcW w:type="dxa" w:w="7597"/>
+            <w:tcW w:type="dxa" w:w="7483"/>
           </w:tcPr>
           <w:p>
             <w:pPr>
@@ -1621,7 +2071,7 @@
                 <w:b w:val="0"/>
                 <w:sz w:val="17"/>
               </w:rPr>
-              <w:t>Pregunta a la sala: "¿Quién aquí necesita el inglés para el trabajo, para un viaje, para estudiar o por sus hijos?" Toma dos respuestas y usa la proyección de esa persona (sección 2).</w:t>
+              <w:t>Pregunta a la sala: "¿Quién aquí necesita el inglés para el trabajo, para un viaje, para estudiar o para montar algo?" Toma dos respuestas y usa la proyección de esa persona (sección 3).</w:t>
             </w:r>
           </w:p>
         </w:tc>
@@ -1629,7 +2079,7 @@
       <w:tr>
         <w:tc>
           <w:tcPr>
-            <w:tcW w:type="dxa" w:w="794"/>
+            <w:tcW w:type="dxa" w:w="907"/>
           </w:tcPr>
           <w:p>
             <w:pPr>
@@ -1663,7 +2113,7 @@
         </w:tc>
         <w:tc>
           <w:tcPr>
-            <w:tcW w:type="dxa" w:w="7597"/>
+            <w:tcW w:type="dxa" w:w="7483"/>
           </w:tcPr>
           <w:p>
             <w:pPr>
@@ -1674,7 +2124,7 @@
                 <w:b w:val="0"/>
                 <w:sz w:val="17"/>
               </w:rPr>
-              <w:t>El texto de la sección 2, completo, en voz alta. "Esto no es para todos, y está bien: es mejor saberlo hoy que en la clase 5."</w:t>
+              <w:t>El texto de la sección 3, completo, en voz alta. "Esto no es para todos, y está bien: es mejor saberlo hoy que en la clase 5."</w:t>
             </w:r>
           </w:p>
         </w:tc>
@@ -1682,7 +2132,7 @@
       <w:tr>
         <w:tc>
           <w:tcPr>
-            <w:tcW w:type="dxa" w:w="794"/>
+            <w:tcW w:type="dxa" w:w="907"/>
           </w:tcPr>
           <w:p>
             <w:pPr>
@@ -1693,7 +2143,7 @@
                 <w:b/>
                 <w:sz w:val="17"/>
               </w:rPr>
-              <w:t>6-9</w:t>
+              <w:t>6-10</w:t>
             </w:r>
           </w:p>
         </w:tc>
@@ -1710,13 +2160,13 @@
                 <w:b w:val="0"/>
                 <w:sz w:val="17"/>
               </w:rPr>
-              <w:t>Cómo son las clases</w:t>
+              <w:t>Lo que nos diferencia</w:t>
             </w:r>
           </w:p>
         </w:tc>
         <w:tc>
           <w:tcPr>
-            <w:tcW w:type="dxa" w:w="7597"/>
+            <w:tcW w:type="dxa" w:w="7483"/>
           </w:tcPr>
           <w:p>
             <w:pPr>
@@ -1727,7 +2177,7 @@
                 <w:b w:val="0"/>
                 <w:sz w:val="17"/>
               </w:rPr>
-              <w:t>Presenciales, grupos de máximo 16, método activo y práctico, video diario, una virtud por bloque. El Módulo de Graduación en una frase: Emprendedor o Pasaporte. El grupo abre el 3 de noviembre; mañana, tarde o noche, de 2 o 4 horas diarias, y el horario lo definen los primeros que se matriculan. La garantía, con su texto exacto y sus condiciones.</w:t>
+              <w:t>Garantía con su texto exacto y sus condiciones; el profesor como mentor; el Módulo de Graduación en una frase (Emprendedor o Pasaporte); las virtudes en una frase. Cómo son las clases: presenciales, grupos de máximo 16, video diario, trabajo fuera de clase. El grupo abre el 3 de noviembre; mañana, tarde o noche, de 2 o 4 horas, y el horario lo definen los primeros que se matriculan.</w:t>
             </w:r>
           </w:p>
         </w:tc>
@@ -1735,7 +2185,7 @@
       <w:tr>
         <w:tc>
           <w:tcPr>
-            <w:tcW w:type="dxa" w:w="794"/>
+            <w:tcW w:type="dxa" w:w="907"/>
           </w:tcPr>
           <w:p>
             <w:pPr>
@@ -1746,7 +2196,7 @@
                 <w:b/>
                 <w:sz w:val="17"/>
               </w:rPr>
-              <w:t>9-13</w:t>
+              <w:t>10-13</w:t>
             </w:r>
           </w:p>
         </w:tc>
@@ -1763,13 +2213,13 @@
                 <w:b w:val="0"/>
                 <w:sz w:val="17"/>
               </w:rPr>
-              <w:t>Precios: las 3 opciones</w:t>
+              <w:t>Precios: las opciones</w:t>
             </w:r>
           </w:p>
         </w:tc>
         <w:tc>
           <w:tcPr>
-            <w:tcW w:type="dxa" w:w="7597"/>
+            <w:tcW w:type="dxa" w:w="7483"/>
           </w:tcPr>
           <w:p>
             <w:pPr>
@@ -1780,7 +2230,7 @@
                 <w:b w:val="0"/>
                 <w:sz w:val="17"/>
               </w:rPr>
-              <w:t>La tabla de la sección 6, en este orden: lo que paga tu empresa (si firmó plan empresa), el completo con la beca de la alianza, y el Arranque solo para quien el completo no le alcance. "No manejamos descuentos: el precio es el precio."</w:t>
+              <w:t>La tabla de la sección 8, en este orden: lo que paga tu empresa (si firmó plan empresa), el completo con la beca de la alianza, y el Arranque solo para quien el completo no le alcance. "No manejamos descuentos: el precio es el precio."</w:t>
             </w:r>
           </w:p>
         </w:tc>
@@ -1788,7 +2238,7 @@
       <w:tr>
         <w:tc>
           <w:tcPr>
-            <w:tcW w:type="dxa" w:w="794"/>
+            <w:tcW w:type="dxa" w:w="907"/>
           </w:tcPr>
           <w:p>
             <w:pPr>
@@ -1822,7 +2272,7 @@
         </w:tc>
         <w:tc>
           <w:tcPr>
-            <w:tcW w:type="dxa" w:w="7597"/>
+            <w:tcW w:type="dxa" w:w="7483"/>
           </w:tcPr>
           <w:p>
             <w:pPr>
@@ -1833,7 +2283,7 @@
                 <w:b w:val="0"/>
                 <w:sz w:val="17"/>
               </w:rPr>
-              <w:t>Cierras ahí mismo con los que estén listos: "Hoy te doy tu número exacto, pagas la inicial (transferencia a la cuenta de Heiiu o tarjeta) y firmas en la sede con coordinación. Los primeros que se matriculan definen el horario del grupo."</w:t>
+              <w:t>Cierras ahí mismo con los que estén listos: "Hoy te doy tu número exacto, pagas (transferencia a la cuenta de Heiiu o tarjeta) y firmas en la sede con coordinación. Los primeros que se matriculan definen el horario del grupo."</w:t>
             </w:r>
           </w:p>
         </w:tc>
@@ -1841,60 +2291,7 @@
       <w:tr>
         <w:tc>
           <w:tcPr>
-            <w:tcW w:type="dxa" w:w="794"/>
-          </w:tcPr>
-          <w:p>
-            <w:pPr>
-              <w:spacing w:after="0"/>
-            </w:pPr>
-            <w:r>
-              <w:rPr>
-                <w:b/>
-                <w:sz w:val="17"/>
-              </w:rPr>
-              <w:t>Si la empresa ya compró los cupos (Plan Empresa)</w:t>
-            </w:r>
-          </w:p>
-        </w:tc>
-        <w:tc>
-          <w:tcPr>
-            <w:tcW w:type="dxa" w:w="1814"/>
-          </w:tcPr>
-          <w:p>
-            <w:pPr>
-              <w:spacing w:after="0"/>
-            </w:pPr>
-            <w:r>
-              <w:rPr>
-                <w:b w:val="0"/>
-                <w:sz w:val="17"/>
-              </w:rPr>
-              <w:t>La charla cambia</w:t>
-            </w:r>
-          </w:p>
-        </w:tc>
-        <w:tc>
-          <w:tcPr>
-            <w:tcW w:type="dxa" w:w="7597"/>
-          </w:tcPr>
-          <w:p>
-            <w:pPr>
-              <w:spacing w:after="0"/>
-            </w:pPr>
-            <w:r>
-              <w:rPr>
-                <w:b w:val="0"/>
-                <w:sz w:val="17"/>
-              </w:rPr>
-              <w:t>No es de venta: son 10 minutos con los colaboradores designados para El Pacto, el horario del grupo y la fecha de inicio, para que nadie llegue sin saber a qué se comprometió. Al resto del personal se les ofrece la beca de la alianza (opción 2): un cupo pagado por la empresa abre la puerta para vender más.</w:t>
-            </w:r>
-          </w:p>
-        </w:tc>
-      </w:tr>
-      <w:tr>
-        <w:tc>
-          <w:tcPr>
-            <w:tcW w:type="dxa" w:w="794"/>
+            <w:tcW w:type="dxa" w:w="907"/>
           </w:tcPr>
           <w:p>
             <w:pPr>
@@ -1928,7 +2325,7 @@
         </w:tc>
         <w:tc>
           <w:tcPr>
-            <w:tcW w:type="dxa" w:w="7597"/>
+            <w:tcW w:type="dxa" w:w="7483"/>
           </w:tcPr>
           <w:p>
             <w:pPr>
@@ -1939,7 +2336,60 @@
                 <w:b w:val="0"/>
                 <w:sz w:val="17"/>
               </w:rPr>
-              <w:t>Pasas la hoja de interesados (hoja INTERESADOS del formato, impresa): nombre, celular, motivo, jornada. Respondes con la sección 8. Con los que no cerraron hoy, dejas en el acto día y hora de tu llamada de seguimiento.</w:t>
+              <w:t>Pasas la hoja de interesados (hoja INTERESADOS del formato, impresa): nombre, celular, motivo, jornada. Respondes con la sección 10. Con los que no cerraron hoy, dejas en el acto día y hora de tu llamada de seguimiento.</w:t>
+            </w:r>
+          </w:p>
+        </w:tc>
+      </w:tr>
+      <w:tr>
+        <w:tc>
+          <w:tcPr>
+            <w:tcW w:type="dxa" w:w="907"/>
+          </w:tcPr>
+          <w:p>
+            <w:pPr>
+              <w:spacing w:after="0"/>
+            </w:pPr>
+            <w:r>
+              <w:rPr>
+                <w:b/>
+                <w:sz w:val="17"/>
+              </w:rPr>
+              <w:t>Si la empresa ya compró los cupos</w:t>
+            </w:r>
+          </w:p>
+        </w:tc>
+        <w:tc>
+          <w:tcPr>
+            <w:tcW w:type="dxa" w:w="1814"/>
+          </w:tcPr>
+          <w:p>
+            <w:pPr>
+              <w:spacing w:after="0"/>
+            </w:pPr>
+            <w:r>
+              <w:rPr>
+                <w:b w:val="0"/>
+                <w:sz w:val="17"/>
+              </w:rPr>
+              <w:t>La charla cambia</w:t>
+            </w:r>
+          </w:p>
+        </w:tc>
+        <w:tc>
+          <w:tcPr>
+            <w:tcW w:type="dxa" w:w="7483"/>
+          </w:tcPr>
+          <w:p>
+            <w:pPr>
+              <w:spacing w:after="0"/>
+            </w:pPr>
+            <w:r>
+              <w:rPr>
+                <w:b w:val="0"/>
+                <w:sz w:val="17"/>
+              </w:rPr>
+              <w:t>No es de venta: son 10 minutos con los colaboradores designados para El Pacto, el horario del grupo y la fecha de inicio, para que nadie llegue sin saber a qué se comprometió. Al resto del personal se les ofrece la beca de la alianza: un cupo pagado por la empresa abre la puerta para vender más.</w:t>
             </w:r>
           </w:p>
         </w:tc>
@@ -1964,7 +2414,7 @@
           <w:b w:val="0"/>
           <w:i w:val="0"/>
           <w:color w:val="666666"/>
-          <w:sz w:val="18"/>
+          <w:sz w:val="17"/>
         </w:rPr>
         <w:t>El mismo día pasas los interesados a la planilla y guardas la hoja física para coordinación. No tomas fotos de la hoja, no creas grupos de WhatsApp con empleados y no compartes los datos con la empresa.</w:t>
       </w:r>
@@ -1980,7 +2430,7 @@
           <w:color w:val="E54C09"/>
           <w:sz w:val="25"/>
         </w:rPr>
-        <w:t>6. Hoja de precios de la charla</w:t>
+        <w:t>8. Hoja de precios</w:t>
       </w:r>
     </w:p>
     <w:tbl>
@@ -2017,7 +2467,7 @@
         </w:tc>
         <w:tc>
           <w:tcPr>
-            <w:tcW w:type="dxa" w:w="1814"/>
+            <w:tcW w:type="dxa" w:w="1928"/>
             <w:shd w:val="clear" w:color="auto" w:fill="E54C09"/>
           </w:tcPr>
           <w:p>
@@ -2036,7 +2486,7 @@
         </w:tc>
         <w:tc>
           <w:tcPr>
-            <w:tcW w:type="dxa" w:w="2778"/>
+            <w:tcW w:type="dxa" w:w="2608"/>
             <w:shd w:val="clear" w:color="auto" w:fill="E54C09"/>
           </w:tcPr>
           <w:p>
@@ -2055,7 +2505,7 @@
         </w:tc>
         <w:tc>
           <w:tcPr>
-            <w:tcW w:type="dxa" w:w="3685"/>
+            <w:tcW w:type="dxa" w:w="3742"/>
             <w:shd w:val="clear" w:color="auto" w:fill="E54C09"/>
           </w:tcPr>
           <w:p>
@@ -2093,7 +2543,7 @@
         </w:tc>
         <w:tc>
           <w:tcPr>
-            <w:tcW w:type="dxa" w:w="1814"/>
+            <w:tcW w:type="dxa" w:w="1928"/>
           </w:tcPr>
           <w:p>
             <w:pPr>
@@ -2104,13 +2554,13 @@
                 <w:b w:val="0"/>
                 <w:sz w:val="17"/>
               </w:rPr>
-              <w:t>Solo si la empresa firmó la Orden Plan Empresa (existe desde 3 cupos; con menos, los empleados pagan con la beca de alianza)</w:t>
+              <w:t>Solo si la empresa firmó la Orden Plan Empresa (existe desde 3 cupos; con menos, cada persona se matricula con la beca de alianza, y la empresa le paga si quiere)</w:t>
             </w:r>
           </w:p>
         </w:tc>
         <w:tc>
           <w:tcPr>
-            <w:tcW w:type="dxa" w:w="2778"/>
+            <w:tcW w:type="dxa" w:w="2608"/>
           </w:tcPr>
           <w:p>
             <w:pPr>
@@ -2127,7 +2577,7 @@
         </w:tc>
         <w:tc>
           <w:tcPr>
-            <w:tcW w:type="dxa" w:w="3685"/>
+            <w:tcW w:type="dxa" w:w="3742"/>
           </w:tcPr>
           <w:p>
             <w:pPr>
@@ -2138,7 +2588,7 @@
                 <w:b w:val="0"/>
                 <w:sz w:val="17"/>
               </w:rPr>
-              <w:t>Lo paga la empresa contra factura: de contado, o inicial (30% en el tramo de 3 a 7; 40% de 8 en adelante) y 3 cuotas mensuales. Copago posible. La empresa escoge a quién le da cada cupo y puede cambiar a la persona antes de la primera clase, siempre que no cambie de horario; después de iniciar, no.</w:t>
+              <w:t>Lo paga la empresa contra factura: de contado, o inicial (30% en el tramo de 3 a 7; 40% de 8 en adelante) y 3 cuotas mensuales. La empresa escoge a quién le da cada cupo y puede cambiar a la persona antes del inicio, sin cambiar de horario; iniciado el nivel, no.</w:t>
             </w:r>
           </w:p>
         </w:tc>
@@ -2163,7 +2613,7 @@
         </w:tc>
         <w:tc>
           <w:tcPr>
-            <w:tcW w:type="dxa" w:w="1814"/>
+            <w:tcW w:type="dxa" w:w="1928"/>
           </w:tcPr>
           <w:p>
             <w:pPr>
@@ -2180,7 +2630,7 @@
         </w:tc>
         <w:tc>
           <w:tcPr>
-            <w:tcW w:type="dxa" w:w="2778"/>
+            <w:tcW w:type="dxa" w:w="2608"/>
           </w:tcPr>
           <w:p>
             <w:pPr>
@@ -2218,7 +2668,7 @@
         </w:tc>
         <w:tc>
           <w:tcPr>
-            <w:tcW w:type="dxa" w:w="3685"/>
+            <w:tcW w:type="dxa" w:w="3742"/>
           </w:tcPr>
           <w:p>
             <w:pPr>
@@ -2229,7 +2679,7 @@
                 <w:b w:val="0"/>
                 <w:sz w:val="17"/>
               </w:rPr>
-              <w:t>Contado: transferencia a la cuenta de Heiiu o tarjeta; crédito de banco o cooperativa y cesantías también cuentan como contado. Cuotas: inicial mínima del 20% ($1.113.088) y cuotas mensuales al 1,9%; firmas pagaré. La cuota exacta la da coordinación con el motor de cuotas, nunca de memoria.</w:t>
+              <w:t>Contado: transferencia a la cuenta de Heiiu o tarjeta; crédito de banco o cooperativa y cesantías también cuentan como contado. Cuotas: inicial mínima del 20% ($1.113.088) y cuotas mensuales al 1,9%; firma pagaré. La cuota exacta la da coordinación con el motor de cuotas, nunca de memoria.</w:t>
             </w:r>
           </w:p>
         </w:tc>
@@ -2254,7 +2704,7 @@
         </w:tc>
         <w:tc>
           <w:tcPr>
-            <w:tcW w:type="dxa" w:w="1814"/>
+            <w:tcW w:type="dxa" w:w="1928"/>
           </w:tcPr>
           <w:p>
             <w:pPr>
@@ -2271,7 +2721,7 @@
         </w:tc>
         <w:tc>
           <w:tcPr>
-            <w:tcW w:type="dxa" w:w="2778"/>
+            <w:tcW w:type="dxa" w:w="2608"/>
           </w:tcPr>
           <w:p>
             <w:pPr>
@@ -2288,7 +2738,7 @@
         </w:tc>
         <w:tc>
           <w:tcPr>
-            <w:tcW w:type="dxa" w:w="3685"/>
+            <w:tcW w:type="dxa" w:w="3742"/>
           </w:tcPr>
           <w:p>
             <w:pPr>
@@ -2300,6 +2750,90 @@
                 <w:sz w:val="17"/>
               </w:rPr>
               <w:t>Contado o máximo dos pagos: la mitad al inscribirse y la otra mitad antes de la primera clase; no hay más cuotas.</w:t>
+            </w:r>
+          </w:p>
+        </w:tc>
+      </w:tr>
+      <w:tr>
+        <w:tc>
+          <w:tcPr>
+            <w:tcW w:type="dxa" w:w="1928"/>
+          </w:tcPr>
+          <w:p>
+            <w:pPr>
+              <w:spacing w:after="0"/>
+            </w:pPr>
+            <w:r>
+              <w:rPr>
+                <w:b/>
+                <w:sz w:val="17"/>
+              </w:rPr>
+              <w:t>4. Inglés para empresarios</w:t>
+            </w:r>
+          </w:p>
+        </w:tc>
+        <w:tc>
+          <w:tcPr>
+            <w:tcW w:type="dxa" w:w="1928"/>
+          </w:tcPr>
+          <w:p>
+            <w:pPr>
+              <w:spacing w:after="0"/>
+            </w:pPr>
+            <w:r>
+              <w:rPr>
+                <w:b w:val="0"/>
+                <w:sz w:val="17"/>
+              </w:rPr>
+              <w:t>El dueño o gerente que lo quiere para él</w:t>
+            </w:r>
+          </w:p>
+        </w:tc>
+        <w:tc>
+          <w:tcPr>
+            <w:tcW w:type="dxa" w:w="2608"/>
+          </w:tcPr>
+          <w:p>
+            <w:pPr>
+              <w:spacing w:after="0"/>
+            </w:pPr>
+            <w:r>
+              <w:rPr>
+                <w:b w:val="0"/>
+                <w:sz w:val="17"/>
+              </w:rPr>
+              <w:t xml:space="preserve">Personalizado, virtual, a su medida: </w:t>
+            </w:r>
+            <w:r>
+              <w:rPr>
+                <w:b/>
+                <w:sz w:val="17"/>
+              </w:rPr>
+              <w:t>$70.000 la hora, mínimo 30 horas</w:t>
+            </w:r>
+            <w:r>
+              <w:rPr>
+                <w:b w:val="0"/>
+                <w:sz w:val="17"/>
+              </w:rPr>
+              <w:t xml:space="preserve"> ($2.100.000)</w:t>
+            </w:r>
+          </w:p>
+        </w:tc>
+        <w:tc>
+          <w:tcPr>
+            <w:tcW w:type="dxa" w:w="3742"/>
+          </w:tcPr>
+          <w:p>
+            <w:pPr>
+              <w:spacing w:after="0"/>
+            </w:pPr>
+            <w:r>
+              <w:rPr>
+                <w:b w:val="0"/>
+                <w:sz w:val="17"/>
+              </w:rPr>
+              <w:t>De contado. Tú lo agendas con gerencia, que arma el plan con él. Cuenta para tu comisión; para la meta cuenta como un inscrito si paga el paquete de 30 horas.</w:t>
             </w:r>
           </w:p>
         </w:tc>
@@ -2325,6 +2859,26 @@
           <w:b/>
           <w:sz w:val="18"/>
         </w:rPr>
+        <w:t>Por qué "beca" y no "descuento":</w:t>
+      </w:r>
+      <w:r>
+        <w:rPr>
+          <w:b w:val="0"/>
+          <w:sz w:val="18"/>
+        </w:rPr>
+        <w:t xml:space="preserve"> el programa vale $8.696.000. Las becas las otorga el Fondo de Becas de la academia, según el perfil del estudiante y con soportes; la alianza con su empresa le da la columna más alta. Un descuento para todo el mundo no es descuento: es el precio, y así lo entiende la ley. Por eso nunca se dice "descuento" ni se suman dos becas: se aplica la mejor.</w:t>
+      </w:r>
+    </w:p>
+    <w:p>
+      <w:pPr>
+        <w:pStyle w:val="ListBullet"/>
+        <w:spacing w:after="0"/>
+      </w:pPr>
+      <w:r>
+        <w:rPr>
+          <w:b/>
+          <w:sz w:val="18"/>
+        </w:rPr>
         <w:t>Becas con el nombre de la empresa</w:t>
       </w:r>
       <w:r>
@@ -2332,7 +2886,7 @@
           <w:b w:val="0"/>
           <w:sz w:val="18"/>
         </w:rPr>
-        <w:t xml:space="preserve"> (las 3 que la empresa elige por trimestre): pagan $4.782.800 aunque vayan a cuotas, con libros y prioridad de cupo. Nunca se suman dos becas: se aplica la mejor.</w:t>
+        <w:t xml:space="preserve"> (las 3 que la empresa elige por trimestre): pagan $4.782.800 aunque vayan a cuotas, con libros y prioridad de cupo.</w:t>
       </w:r>
     </w:p>
     <w:p>
@@ -2352,7 +2906,7 @@
           <w:b w:val="0"/>
           <w:sz w:val="18"/>
         </w:rPr>
-        <w:t xml:space="preserve"> puede entrar a un grupo que ya va andando, pero eso lo define y lo cotiza gerencia, caso por caso; tú lo agendas, no lo cierras. El foco del reto es la gente que empieza de cero: es lo más fácil de cerrar y lo que abre el grupo del 3 de noviembre.</w:t>
+        <w:t xml:space="preserve"> puede entrar a un grupo que ya va andando, pero eso lo define y lo cotiza gerencia, caso por caso; tú lo agendas, no lo cierras. La sesión de ubicación se coordina para el día siguiente, sin excepción. El foco del reto es la gente que empieza de cero: es lo más fácil de cerrar y lo que abre el grupo del 3 de noviembre.</w:t>
       </w:r>
     </w:p>
     <w:p>
@@ -2406,7 +2960,20 @@
           <w:color w:val="E54C09"/>
           <w:sz w:val="25"/>
         </w:rPr>
-        <w:t>7. Proceso de inscripción paso a paso</w:t>
+        <w:t>9. Proceso de inscripción paso a paso (cuando toca activación)</w:t>
+      </w:r>
+    </w:p>
+    <w:p>
+      <w:pPr>
+        <w:spacing w:after="20"/>
+      </w:pPr>
+      <w:r>
+        <w:rPr>
+          <w:b w:val="0"/>
+          <w:i w:val="0"/>
+          <w:sz w:val="18"/>
+        </w:rPr>
+        <w:t>Es el camino menos preferido: lo mejor es que la empresa invierta con el plan empresa. Cuando no, cada persona se inscribe así:</w:t>
       </w:r>
     </w:p>
     <w:tbl>
@@ -2563,7 +3130,7 @@
                 <w:b w:val="0"/>
                 <w:sz w:val="17"/>
               </w:rPr>
-              <w:t>Lo haces tú, en la charla o en el seguimiento (llamada o en la sede), en unos 20 minutos. Orden: motivo, para quién y quién decide, nivel, jornada, El Pacto, forma de pago; solo entonces el número exacto. "Ya sé algo": la sesión de ubicación se coordina con la academia para el día siguiente, sin excepción; tú la agendas en el acto y gerencia define en qué grupo entra.</w:t>
+              <w:t>Lo haces tú, en la charla o en el seguimiento (llamada o en la sede), en unos 20 minutos. Orden: motivo, para quién y quién decide, nivel, jornada, El Pacto, forma de pago; solo entonces el número exacto. "Ya sé algo": sesión de ubicación al día siguiente, sin excepción; gerencia define en qué grupo entra.</w:t>
             </w:r>
           </w:p>
         </w:tc>
@@ -2599,7 +3166,7 @@
                 <w:b/>
                 <w:sz w:val="17"/>
               </w:rPr>
-              <w:t>3. Inicial pagada</w:t>
+              <w:t>3. Pago</w:t>
             </w:r>
           </w:p>
         </w:tc>
@@ -2616,7 +3183,7 @@
                 <w:b w:val="0"/>
                 <w:sz w:val="17"/>
               </w:rPr>
-              <w:t>Transferencia a la cuenta de Heiiu o tarjeta, con pantallazo del comprobante (la cédula se presenta en la sede, no se envía por chat); efectivo, a la sede el mismo día con recibo de coordinación. Para entrar el 3 de noviembre, pagada antes de esa fecha. Coordinación recibe y verifica el pago.</w:t>
+              <w:t>De contado idealmente. Transferencia a la cuenta de Heiiu o tarjeta, con pantallazo del comprobante (la cédula se presenta en la sede, no se envía por chat); efectivo, a la sede el mismo día con recibo de coordinación. Para entrar el 3 de noviembre, pagado antes de esa fecha. Coordinación recibe y verifica el pago.</w:t>
             </w:r>
           </w:p>
         </w:tc>
@@ -2652,7 +3219,7 @@
                 <w:b/>
                 <w:sz w:val="17"/>
               </w:rPr>
-              <w:t>4. Contrato y pagaré</w:t>
+              <w:t>4. Contrato</w:t>
             </w:r>
           </w:p>
         </w:tc>
@@ -2669,7 +3236,7 @@
                 <w:b w:val="0"/>
                 <w:sz w:val="17"/>
               </w:rPr>
-              <w:t>Tú llevas o envías al estudiante a la sede. Allí, en físico: contrato de matrícula, anexo de garantía y pagaré si va a cuotas (si requiere codeudor se define ahí). Menor de 18: firma el acudiente.</w:t>
+              <w:t>El estudiante va a la sede. Allí, en físico: contrato de matrícula, anexo de garantía y, solo si va a cuotas, el pagaré (si requiere codeudor se define ahí). Menor de 18: firma el acudiente.</w:t>
             </w:r>
           </w:p>
         </w:tc>
@@ -2722,7 +3289,7 @@
                 <w:b w:val="0"/>
                 <w:sz w:val="17"/>
               </w:rPr>
-              <w:t>Grupo del 3 de noviembre; el horario lo definen los primeros matriculados (empresa con 8 o más: su propio horario). Plan Empresa: la orden la firma gerencia y la empresa designa a sus colaboradores; puede cambiar a la persona antes de la primera clase sin cambiar de horario.</w:t>
+              <w:t>Grupo del 3 de noviembre; el horario lo definen los primeros matriculados (empresa con 8 o más: su propio horario). Plan Empresa: la orden la firma gerencia y la empresa designa a sus colaboradores; puede cambiar a la persona antes del inicio sin cambiar de horario.</w:t>
             </w:r>
           </w:p>
         </w:tc>
@@ -2786,14 +3353,14 @@
                 <w:b w:val="0"/>
                 <w:sz w:val="18"/>
               </w:rPr>
-              <w:t xml:space="preserve"> la inicial (o el pago de contado) </w:t>
+              <w:t xml:space="preserve"> pagó de contado, o pagó la inicial de su plan de pagos y firmó el contrato con coordinación, </w:t>
             </w:r>
             <w:r>
               <w:rPr>
                 <w:b/>
                 <w:sz w:val="18"/>
               </w:rPr>
-              <w:t>en la cuenta de Heiiu, verificada por coordinación,</w:t>
+              <w:t>en la cuenta de Heiiu y verificado por coordinación,</w:t>
             </w:r>
             <w:r>
               <w:rPr>
@@ -2819,7 +3386,21 @@
                 <w:b w:val="0"/>
                 <w:sz w:val="18"/>
               </w:rPr>
-              <w:t xml:space="preserve"> una promesa de pago, un pantallazo sin verificar, dinero que alguien te entregue a ti. El abono de separación de $300.000 NO cuenta: solo la inicial del 20% o el pago de contado.</w:t>
+              <w:t xml:space="preserve"> una promesa de pago, un pantallazo sin verificar, dinero que alguien te entregue a ti, ni el abono de separación de $300.000 solo. </w:t>
+            </w:r>
+            <w:r>
+              <w:rPr>
+                <w:b/>
+                <w:sz w:val="18"/>
+              </w:rPr>
+              <w:t>Los que ya venían avanzados</w:t>
+            </w:r>
+            <w:r>
+              <w:rPr>
+                <w:b w:val="0"/>
+                <w:sz w:val="18"/>
+              </w:rPr>
+              <w:t xml:space="preserve"> y que la academia te entregue para cerrar: te pagan comisión, pero no cuentan para los 10.</w:t>
             </w:r>
           </w:p>
         </w:tc>
@@ -2846,7 +3427,7 @@
           <w:color w:val="E54C09"/>
           <w:sz w:val="25"/>
         </w:rPr>
-        <w:t>8. Objeciones frecuentes: la respuesta corta</w:t>
+        <w:t>10. Objeciones frecuentes: la respuesta corta</w:t>
       </w:r>
     </w:p>
     <w:tbl>
@@ -3002,7 +3583,7 @@
                 <w:b w:val="0"/>
                 <w:sz w:val="17"/>
               </w:rPr>
-              <w:t>"Perfecto: el nivel lo define la academia en una sesión de ubicación corta, y entras en el nivel que te corresponde." Coordinación la agenda; si quiere, hace antes la prueba EF SET gratuita en línea.</w:t>
+              <w:t>"Perfecto: el nivel lo define la academia en una sesión de ubicación corta, mañana mismo, y entras en el nivel que te corresponde."</w:t>
             </w:r>
           </w:p>
         </w:tc>
@@ -3038,7 +3619,7 @@
                 <w:b w:val="0"/>
                 <w:sz w:val="17"/>
               </w:rPr>
-              <w:t>"En grupo somos presenciales; virtual tenemos las clases personalizadas por videollamada, desde 30 horas, a tu horario, y las cotiza la dirección académica."</w:t>
+              <w:t>"En grupo somos presenciales; virtual tenemos las clases personalizadas por videollamada, desde 30 horas, a tu horario, y las arma gerencia contigo."</w:t>
             </w:r>
           </w:p>
         </w:tc>
@@ -3201,6 +3782,42 @@
                 <w:b/>
                 <w:sz w:val="17"/>
               </w:rPr>
+              <w:t>"Es para mi hijo de 9"</w:t>
+            </w:r>
+          </w:p>
+        </w:tc>
+        <w:tc>
+          <w:tcPr>
+            <w:tcW w:type="dxa" w:w="8277"/>
+          </w:tcPr>
+          <w:p>
+            <w:pPr>
+              <w:spacing w:after="0"/>
+            </w:pPr>
+            <w:r>
+              <w:rPr>
+                <w:b w:val="0"/>
+                <w:sz w:val="17"/>
+              </w:rPr>
+              <w:t>"Todavía no: empezamos desde los 12 años. Cuando los cumpla, el sabatino es el camino."</w:t>
+            </w:r>
+          </w:p>
+        </w:tc>
+      </w:tr>
+      <w:tr>
+        <w:tc>
+          <w:tcPr>
+            <w:tcW w:type="dxa" w:w="1928"/>
+          </w:tcPr>
+          <w:p>
+            <w:pPr>
+              <w:spacing w:after="0"/>
+            </w:pPr>
+            <w:r>
+              <w:rPr>
+                <w:b/>
+                <w:sz w:val="17"/>
+              </w:rPr>
               <w:t>Nombra otra academia</w:t>
             </w:r>
           </w:p>
@@ -3245,7 +3862,7 @@
           <w:color w:val="E54C09"/>
           <w:sz w:val="25"/>
         </w:rPr>
-        <w:t>9. Reglas innegociables</w:t>
+        <w:t>11. Reglas innegociables</w:t>
       </w:r>
     </w:p>
     <w:p>
@@ -3256,7 +3873,7 @@
       <w:r>
         <w:rPr>
           <w:b w:val="0"/>
-          <w:sz w:val="19"/>
+          <w:sz w:val="18"/>
         </w:rPr>
         <w:t>Solo los precios de este kit. Ningún descuento, beca, promoción, cupo, fecha ni condición distinta: lo que no está aquí, se agenda con gerencia.</w:t>
       </w:r>
@@ -3269,9 +3886,9 @@
       <w:r>
         <w:rPr>
           <w:b w:val="0"/>
-          <w:sz w:val="19"/>
+          <w:sz w:val="18"/>
         </w:rPr>
-        <w:t>No hay clase de prueba. No hay clases virtuales en grupo. No se habla de profesores nativos ni del equipo docente: se vende método, respaldo y garantía.</w:t>
+        <w:t>No hay clase de prueba. No hay clases virtuales en grupo. No se habla de profesores nativos ni del equipo docente: se vende método, mentor, respaldo y garantía.</w:t>
       </w:r>
     </w:p>
     <w:p>
@@ -3282,7 +3899,7 @@
       <w:r>
         <w:rPr>
           <w:b w:val="0"/>
-          <w:sz w:val="19"/>
+          <w:sz w:val="18"/>
         </w:rPr>
         <w:t>Nunca "fácil", "rápido", "gratis", "patrocinio", "descuento", "bilingüe en X meses"; nunca se promete empleo, visa ni resultado. Se dice "beca del Fondo" y "sin costo para la empresa".</w:t>
       </w:r>
@@ -3295,7 +3912,7 @@
       <w:r>
         <w:rPr>
           <w:b w:val="0"/>
-          <w:sz w:val="19"/>
+          <w:sz w:val="18"/>
         </w:rPr>
         <w:t>No se nombran otras academias. No se nombran métodos: se dice "clases inmersivas, activas y prácticas".</w:t>
       </w:r>
@@ -3308,9 +3925,9 @@
       <w:r>
         <w:rPr>
           <w:b w:val="0"/>
-          <w:sz w:val="19"/>
+          <w:sz w:val="18"/>
         </w:rPr>
-        <w:t>Una sola fecha de inicio: martes 3 de noviembre. No se promete horario: lo definen los primeros matriculados.</w:t>
+        <w:t>Una sola fecha de inicio: martes 3 de noviembre. No se promete horario: lo definen los primeros matriculados. Menores de 12: no.</w:t>
       </w:r>
     </w:p>
     <w:p>
@@ -3321,7 +3938,7 @@
       <w:r>
         <w:rPr>
           <w:b w:val="0"/>
-          <w:sz w:val="19"/>
+          <w:sz w:val="18"/>
         </w:rPr>
         <w:t>Todo pago entra a Heiiu: transferencia o tarjeta; el efectivo llega a la sede el mismo día y coordinación expide el recibo. Nunca te quedas con dinero. Tú no firmas por Heiiu.</w:t>
       </w:r>
@@ -3334,7 +3951,7 @@
       <w:r>
         <w:rPr>
           <w:b w:val="0"/>
-          <w:sz w:val="19"/>
+          <w:sz w:val="18"/>
         </w:rPr>
         <w:t>Los datos personales de interesados y decisores van solo en la planilla y en la hoja física de la charla; no se comparten con nadie, tampoco con la empresa.</w:t>
       </w:r>
@@ -3347,7 +3964,7 @@
       <w:r>
         <w:rPr>
           <w:b w:val="0"/>
-          <w:sz w:val="19"/>
+          <w:sz w:val="18"/>
         </w:rPr>
         <w:t>Toda empresa queda registrada en el formato antes de la primera reunión.</w:t>
       </w:r>
@@ -3360,9 +3977,9 @@
       <w:r>
         <w:rPr>
           <w:b w:val="0"/>
-          <w:sz w:val="19"/>
+          <w:sz w:val="18"/>
         </w:rPr>
-        <w:t>15 minutos con gerencia todos los días a las 8:00 a. m., sin cancelar. La planilla al día, todos los días, antes de esa llamada.</w:t>
+        <w:t>15 minutos con gerencia todos los días a las 8:30 a. m., sin cancelar. La planilla al día, todos los días, antes de esa llamada.</w:t>
       </w:r>
     </w:p>
     <w:p>
@@ -3376,7 +3993,7 @@
           <w:color w:val="E54C09"/>
           <w:sz w:val="25"/>
         </w:rPr>
-        <w:t>10. Ritmo del reto día a día</w:t>
+        <w:t>12. Ritmo del reto día a día</w:t>
       </w:r>
     </w:p>
     <w:tbl>
@@ -3560,7 +4177,7 @@
                 <w:b w:val="0"/>
                 <w:sz w:val="17"/>
               </w:rPr>
-              <w:t xml:space="preserve"> para la semana 2, con fecha.</w:t>
+              <w:t xml:space="preserve"> (o planes empresa en firma) para la semana 2, con fecha.</w:t>
             </w:r>
           </w:p>
         </w:tc>
@@ -3675,7 +4292,7 @@
                 <w:b w:val="0"/>
                 <w:sz w:val="17"/>
               </w:rPr>
-              <w:t xml:space="preserve"> inscritos con inicial pagada y verificada por coordinación. Planilla cerrada y cuenta de cobro. Ese mismo día abre el grupo del 3 de noviembre.</w:t>
+              <w:t xml:space="preserve"> inscritos pagados y verificados por coordinación. Planilla cerrada y cuenta de cobro. Ese mismo día abre el grupo del 3 de noviembre.</w:t>
             </w:r>
           </w:p>
         </w:tc>
@@ -3702,7 +4319,7 @@
           <w:color w:val="E54C09"/>
           <w:sz w:val="21"/>
         </w:rPr>
-        <w:t>Qué llevas en la maleta</w:t>
+        <w:t>Qué llevas en la maleta (todo está en tu carpeta)</w:t>
       </w:r>
     </w:p>
     <w:tbl>
@@ -3732,13 +4349,13 @@
                 <w:color w:val="FFFFFF"/>
                 <w:sz w:val="17"/>
               </w:rPr>
-              <w:t>Archivo (en recursos/comercial/B2B/)</w:t>
+              <w:t>Archivo</w:t>
             </w:r>
           </w:p>
         </w:tc>
         <w:tc>
           <w:tcPr>
-            <w:tcW w:type="dxa" w:w="3061"/>
+            <w:tcW w:type="dxa" w:w="2835"/>
             <w:shd w:val="clear" w:color="auto" w:fill="E54C09"/>
           </w:tcPr>
           <w:p>
@@ -3757,7 +4374,7 @@
         </w:tc>
         <w:tc>
           <w:tcPr>
-            <w:tcW w:type="dxa" w:w="3628"/>
+            <w:tcW w:type="dxa" w:w="3855"/>
             <w:shd w:val="clear" w:color="auto" w:fill="E54C09"/>
           </w:tcPr>
           <w:p>
@@ -3789,13 +4406,13 @@
                 <w:b/>
                 <w:sz w:val="17"/>
               </w:rPr>
-              <w:t>CONVENIO_HEIIU_BUSINESS_PARTNER_v1.pdf</w:t>
+              <w:t>ORDEN_PLAN_EMPRESA_v1.pdf</w:t>
             </w:r>
           </w:p>
         </w:tc>
         <w:tc>
           <w:tcPr>
-            <w:tcW w:type="dxa" w:w="3061"/>
+            <w:tcW w:type="dxa" w:w="2835"/>
           </w:tcPr>
           <w:p>
             <w:pPr>
@@ -3806,66 +4423,13 @@
                 <w:b w:val="0"/>
                 <w:sz w:val="17"/>
               </w:rPr>
-              <w:t>Lo firma la empresa en el modelo A</w:t>
+              <w:t>Lo firma la empresa cuando paga los cupos</w:t>
             </w:r>
           </w:p>
         </w:tc>
         <w:tc>
           <w:tcPr>
-            <w:tcW w:type="dxa" w:w="3628"/>
-          </w:tcPr>
-          <w:p>
-            <w:pPr>
-              <w:spacing w:after="0"/>
-            </w:pPr>
-            <w:r>
-              <w:rPr>
-                <w:b w:val="0"/>
-                <w:sz w:val="17"/>
-              </w:rPr>
-              <w:t>Firma por Heiiu el representante legal (gerencia).</w:t>
-            </w:r>
-          </w:p>
-        </w:tc>
-      </w:tr>
-      <w:tr>
-        <w:tc>
-          <w:tcPr>
-            <w:tcW w:type="dxa" w:w="3515"/>
-          </w:tcPr>
-          <w:p>
-            <w:pPr>
-              <w:spacing w:after="0"/>
-            </w:pPr>
-            <w:r>
-              <w:rPr>
-                <w:b/>
-                <w:sz w:val="17"/>
-              </w:rPr>
-              <w:t>ORDEN_PLAN_EMPRESA_v1.pdf</w:t>
-            </w:r>
-          </w:p>
-        </w:tc>
-        <w:tc>
-          <w:tcPr>
-            <w:tcW w:type="dxa" w:w="3061"/>
-          </w:tcPr>
-          <w:p>
-            <w:pPr>
-              <w:spacing w:after="0"/>
-            </w:pPr>
-            <w:r>
-              <w:rPr>
-                <w:b w:val="0"/>
-                <w:sz w:val="17"/>
-              </w:rPr>
-              <w:t>Lo firma la empresa en el modelo B</w:t>
-            </w:r>
-          </w:p>
-        </w:tc>
-        <w:tc>
-          <w:tcPr>
-            <w:tcW w:type="dxa" w:w="3628"/>
+            <w:tcW w:type="dxa" w:w="3855"/>
           </w:tcPr>
           <w:p>
             <w:pPr>
@@ -3895,13 +4459,13 @@
                 <w:b/>
                 <w:sz w:val="17"/>
               </w:rPr>
-              <w:t>COMPARATIVO_BENEFICIO_ALIANZA.pdf</w:t>
+              <w:t>CONVENIO_HEIIU_BUSINESS_PARTNER_v1.pdf</w:t>
             </w:r>
           </w:p>
         </w:tc>
         <w:tc>
           <w:tcPr>
-            <w:tcW w:type="dxa" w:w="3061"/>
+            <w:tcW w:type="dxa" w:w="2835"/>
           </w:tcPr>
           <w:p>
             <w:pPr>
@@ -3912,13 +4476,13 @@
                 <w:b w:val="0"/>
                 <w:sz w:val="17"/>
               </w:rPr>
-              <w:t>Tu referencia de las dos ofertas en pesos</w:t>
+              <w:t>Lo firma la empresa en la alianza sin costo</w:t>
             </w:r>
           </w:p>
         </w:tc>
         <w:tc>
           <w:tcPr>
-            <w:tcW w:type="dxa" w:w="3628"/>
+            <w:tcW w:type="dxa" w:w="3855"/>
           </w:tcPr>
           <w:p>
             <w:pPr>
@@ -3929,7 +4493,7 @@
                 <w:b w:val="0"/>
                 <w:sz w:val="17"/>
               </w:rPr>
-              <w:t>Es para ti: no se entrega (trae columnas internas).</w:t>
+              <w:t>Firma por Heiiu el representante legal (gerencia). Se firma con fecha de charla.</w:t>
             </w:r>
           </w:p>
         </w:tc>
@@ -3948,13 +4512,13 @@
                 <w:b/>
                 <w:sz w:val="17"/>
               </w:rPr>
-              <w:t>CARTA_BUSINESS_PARTNER_v3.pdf</w:t>
+              <w:t>CARTA_POSTULACION_EMPRESA_ALIADA.pdf</w:t>
             </w:r>
           </w:p>
         </w:tc>
         <w:tc>
           <w:tcPr>
-            <w:tcW w:type="dxa" w:w="3061"/>
+            <w:tcW w:type="dxa" w:w="2835"/>
           </w:tcPr>
           <w:p>
             <w:pPr>
@@ -3965,13 +4529,13 @@
                 <w:b w:val="0"/>
                 <w:sz w:val="17"/>
               </w:rPr>
-              <w:t>Carta de invitación a la empresa</w:t>
+              <w:t>Una por colaborador de empresa aliada</w:t>
             </w:r>
           </w:p>
         </w:tc>
         <w:tc>
           <w:tcPr>
-            <w:tcW w:type="dxa" w:w="3628"/>
+            <w:tcW w:type="dxa" w:w="3855"/>
           </w:tcPr>
           <w:p>
             <w:pPr>
@@ -3982,7 +4546,7 @@
                 <w:b w:val="0"/>
                 <w:sz w:val="17"/>
               </w:rPr>
-              <w:t>Trae fecha de septiembre y una regla vieja de beca: no se entrega hasta que gerencia la actualice.</w:t>
+              <w:t>La emite la empresa; se entrega en la sede con el contrato. Sin carta no aplica la beca de alianza.</w:t>
             </w:r>
           </w:p>
         </w:tc>
@@ -4001,13 +4565,13 @@
                 <w:b/>
                 <w:sz w:val="17"/>
               </w:rPr>
-              <w:t>PROPUESTA_B2B_EMPRESAS.pdf</w:t>
+              <w:t>Flyer dos caminos.pdf</w:t>
             </w:r>
           </w:p>
         </w:tc>
         <w:tc>
           <w:tcPr>
-            <w:tcW w:type="dxa" w:w="3061"/>
+            <w:tcW w:type="dxa" w:w="2835"/>
           </w:tcPr>
           <w:p>
             <w:pPr>
@@ -4018,13 +4582,13 @@
                 <w:b w:val="0"/>
                 <w:sz w:val="17"/>
               </w:rPr>
-              <w:t>Propuesta de julio</w:t>
+              <w:t>Para mostrar en la charla y en el cierre</w:t>
             </w:r>
           </w:p>
         </w:tc>
         <w:tc>
           <w:tcPr>
-            <w:tcW w:type="dxa" w:w="3628"/>
+            <w:tcW w:type="dxa" w:w="3855"/>
           </w:tcPr>
           <w:p>
             <w:pPr>
@@ -4035,7 +4599,60 @@
                 <w:b w:val="0"/>
                 <w:sz w:val="17"/>
               </w:rPr>
-              <w:t>Trae menú, profesor nativo y modalidad virtual que ya no aplican: no se entrega ni se lee hasta que gerencia la actualice.</w:t>
+              <w:t>Arranque o completo: se explica en un minuto.</w:t>
+            </w:r>
+          </w:p>
+        </w:tc>
+      </w:tr>
+      <w:tr>
+        <w:tc>
+          <w:tcPr>
+            <w:tcW w:type="dxa" w:w="3515"/>
+          </w:tcPr>
+          <w:p>
+            <w:pPr>
+              <w:spacing w:after="0"/>
+            </w:pPr>
+            <w:r>
+              <w:rPr>
+                <w:b/>
+                <w:sz w:val="17"/>
+              </w:rPr>
+              <w:t>FORMATO_15_EMPRESAS_RETO.xlsx</w:t>
+            </w:r>
+          </w:p>
+        </w:tc>
+        <w:tc>
+          <w:tcPr>
+            <w:tcW w:type="dxa" w:w="2835"/>
+          </w:tcPr>
+          <w:p>
+            <w:pPr>
+              <w:spacing w:after="0"/>
+            </w:pPr>
+            <w:r>
+              <w:rPr>
+                <w:b w:val="0"/>
+                <w:sz w:val="17"/>
+              </w:rPr>
+              <w:t>Tu planilla: empresas, reporte diario, interesados</w:t>
+            </w:r>
+          </w:p>
+        </w:tc>
+        <w:tc>
+          <w:tcPr>
+            <w:tcW w:type="dxa" w:w="3855"/>
+          </w:tcPr>
+          <w:p>
+            <w:pPr>
+              <w:spacing w:after="0"/>
+            </w:pPr>
+            <w:r>
+              <w:rPr>
+                <w:b w:val="0"/>
+                <w:sz w:val="17"/>
+              </w:rPr>
+              <w:t>Al día antes de las 8:30 de cada día.</w:t>
             </w:r>
           </w:p>
         </w:tc>
@@ -4061,7 +4678,407 @@
           <w:i w:val="0"/>
           <w:sz w:val="18"/>
         </w:rPr>
-        <w:t>Además: este kit, la planilla en el celular, 10 hojas INTERESADOS impresas y la carta de postulación de la empresa para cada colaborador (modelo: CARTA_POSTULACION_EMPRESA_ALIADA.pdf, en B2B/). Transporte y celular son tuyos.</w:t>
+        <w:t>Además: este kit, 10 hojas INTERESADOS impresas y el número de cuenta que te entrega gerencia el lunes. Transporte y celular son tuyos. Para la cuenta de cobro del 3 de noviembre: RUT y documento de identidad vigente; coordinación te los pide el lunes.</w:t>
+      </w:r>
+    </w:p>
+    <w:p>
+      <w:pPr>
+        <w:keepNext/>
+        <w:spacing w:before="140" w:after="40"/>
+      </w:pPr>
+      <w:r>
+        <w:rPr>
+          <w:b/>
+          <w:color w:val="E54C09"/>
+          <w:sz w:val="25"/>
+        </w:rPr>
+        <w:t>13. Tu compensación en el reto</w:t>
+      </w:r>
+    </w:p>
+    <w:tbl>
+      <w:tblPr>
+        <w:tblStyle w:val="TableGrid"/>
+        <w:tblW w:type="auto" w:w="0"/>
+        <w:tblLook w:firstColumn="1" w:firstRow="1" w:lastColumn="0" w:lastRow="0" w:noHBand="0" w:noVBand="1" w:val="04A0"/>
+      </w:tblPr>
+      <w:tblGrid>
+        <w:gridCol w:w="3513"/>
+        <w:gridCol w:w="3513"/>
+        <w:gridCol w:w="3513"/>
+      </w:tblGrid>
+      <w:tr>
+        <w:tc>
+          <w:tcPr>
+            <w:tcW w:type="dxa" w:w="2041"/>
+            <w:shd w:val="clear" w:color="auto" w:fill="E54C09"/>
+          </w:tcPr>
+          <w:p>
+            <w:pPr>
+              <w:spacing w:after="0"/>
+            </w:pPr>
+            <w:r>
+              <w:rPr>
+                <w:b/>
+                <w:color w:val="FFFFFF"/>
+                <w:sz w:val="17"/>
+              </w:rPr>
+              <w:t>Concepto</w:t>
+            </w:r>
+          </w:p>
+        </w:tc>
+        <w:tc>
+          <w:tcPr>
+            <w:tcW w:type="dxa" w:w="2835"/>
+            <w:shd w:val="clear" w:color="auto" w:fill="E54C09"/>
+          </w:tcPr>
+          <w:p>
+            <w:pPr>
+              <w:spacing w:after="0"/>
+            </w:pPr>
+            <w:r>
+              <w:rPr>
+                <w:b/>
+                <w:color w:val="FFFFFF"/>
+                <w:sz w:val="17"/>
+              </w:rPr>
+              <w:t>Cuánto</w:t>
+            </w:r>
+          </w:p>
+        </w:tc>
+        <w:tc>
+          <w:tcPr>
+            <w:tcW w:type="dxa" w:w="5329"/>
+            <w:shd w:val="clear" w:color="auto" w:fill="E54C09"/>
+          </w:tcPr>
+          <w:p>
+            <w:pPr>
+              <w:spacing w:after="0"/>
+            </w:pPr>
+            <w:r>
+              <w:rPr>
+                <w:b/>
+                <w:color w:val="FFFFFF"/>
+                <w:sz w:val="17"/>
+              </w:rPr>
+              <w:t>Cuándo y cómo</w:t>
+            </w:r>
+          </w:p>
+        </w:tc>
+      </w:tr>
+      <w:tr>
+        <w:tc>
+          <w:tcPr>
+            <w:tcW w:type="dxa" w:w="2041"/>
+          </w:tcPr>
+          <w:p>
+            <w:pPr>
+              <w:spacing w:after="0"/>
+            </w:pPr>
+            <w:r>
+              <w:rPr>
+                <w:b/>
+                <w:sz w:val="17"/>
+              </w:rPr>
+              <w:t>Honorarios del reto</w:t>
+            </w:r>
+          </w:p>
+        </w:tc>
+        <w:tc>
+          <w:tcPr>
+            <w:tcW w:type="dxa" w:w="2835"/>
+          </w:tcPr>
+          <w:p>
+            <w:pPr>
+              <w:spacing w:after="0"/>
+            </w:pPr>
+            <w:r>
+              <w:rPr>
+                <w:b w:val="0"/>
+                <w:sz w:val="17"/>
+              </w:rPr>
+              <w:t>$1.000.000</w:t>
+            </w:r>
+          </w:p>
+        </w:tc>
+        <w:tc>
+          <w:tcPr>
+            <w:tcW w:type="dxa" w:w="5329"/>
+          </w:tcPr>
+          <w:p>
+            <w:pPr>
+              <w:spacing w:after="0"/>
+            </w:pPr>
+            <w:r>
+              <w:rPr>
+                <w:b w:val="0"/>
+                <w:sz w:val="17"/>
+              </w:rPr>
+              <w:t>Contra cuenta de cobro el 3 de noviembre. Se pagan pase lo que pase con la meta.</w:t>
+            </w:r>
+          </w:p>
+        </w:tc>
+      </w:tr>
+      <w:tr>
+        <w:tc>
+          <w:tcPr>
+            <w:tcW w:type="dxa" w:w="2041"/>
+          </w:tcPr>
+          <w:p>
+            <w:pPr>
+              <w:spacing w:after="0"/>
+            </w:pPr>
+            <w:r>
+              <w:rPr>
+                <w:b/>
+                <w:sz w:val="17"/>
+              </w:rPr>
+              <w:t>Comisión</w:t>
+            </w:r>
+          </w:p>
+        </w:tc>
+        <w:tc>
+          <w:tcPr>
+            <w:tcW w:type="dxa" w:w="2835"/>
+          </w:tcPr>
+          <w:p>
+            <w:pPr>
+              <w:spacing w:after="0"/>
+            </w:pPr>
+            <w:r>
+              <w:rPr>
+                <w:b w:val="0"/>
+                <w:sz w:val="17"/>
+              </w:rPr>
+              <w:t>10% de lo que entre a caja hasta el 3 de noviembre por tus inscritos</w:t>
+            </w:r>
+          </w:p>
+        </w:tc>
+        <w:tc>
+          <w:tcPr>
+            <w:tcW w:type="dxa" w:w="5329"/>
+          </w:tcPr>
+          <w:p>
+            <w:pPr>
+              <w:spacing w:after="0"/>
+            </w:pPr>
+            <w:r>
+              <w:rPr>
+                <w:b w:val="0"/>
+                <w:sz w:val="17"/>
+              </w:rPr>
+              <w:t>Se paga aunque no llegues a la meta. Si un inscrito paga inicial y cuotas, el 3 de noviembre se liquida el 10% de la inicial y el 10% de cada cuota cuando entra.</w:t>
+            </w:r>
+          </w:p>
+        </w:tc>
+      </w:tr>
+      <w:tr>
+        <w:tc>
+          <w:tcPr>
+            <w:tcW w:type="dxa" w:w="2041"/>
+          </w:tcPr>
+          <w:p>
+            <w:pPr>
+              <w:spacing w:after="0"/>
+            </w:pPr>
+            <w:r>
+              <w:rPr>
+                <w:b/>
+                <w:sz w:val="17"/>
+              </w:rPr>
+              <w:t>Bono</w:t>
+            </w:r>
+          </w:p>
+        </w:tc>
+        <w:tc>
+          <w:tcPr>
+            <w:tcW w:type="dxa" w:w="2835"/>
+          </w:tcPr>
+          <w:p>
+            <w:pPr>
+              <w:spacing w:after="0"/>
+            </w:pPr>
+            <w:r>
+              <w:rPr>
+                <w:b w:val="0"/>
+                <w:sz w:val="17"/>
+              </w:rPr>
+              <w:t>$1.000.000 de contado</w:t>
+            </w:r>
+          </w:p>
+        </w:tc>
+        <w:tc>
+          <w:tcPr>
+            <w:tcW w:type="dxa" w:w="5329"/>
+          </w:tcPr>
+          <w:p>
+            <w:pPr>
+              <w:spacing w:after="0"/>
+            </w:pPr>
+            <w:r>
+              <w:rPr>
+                <w:b w:val="0"/>
+                <w:sz w:val="17"/>
+              </w:rPr>
+              <w:t>Solo si llegas a 10 inscritos pagados al 3 de noviembre a las 6:00 p. m.</w:t>
+            </w:r>
+          </w:p>
+        </w:tc>
+      </w:tr>
+      <w:tr>
+        <w:tc>
+          <w:tcPr>
+            <w:tcW w:type="dxa" w:w="2041"/>
+          </w:tcPr>
+          <w:p>
+            <w:pPr>
+              <w:spacing w:after="0"/>
+            </w:pPr>
+            <w:r>
+              <w:rPr>
+                <w:b/>
+                <w:sz w:val="17"/>
+              </w:rPr>
+              <w:t>Los que ya venían avanzados</w:t>
+            </w:r>
+          </w:p>
+        </w:tc>
+        <w:tc>
+          <w:tcPr>
+            <w:tcW w:type="dxa" w:w="2835"/>
+          </w:tcPr>
+          <w:p>
+            <w:pPr>
+              <w:spacing w:after="0"/>
+            </w:pPr>
+            <w:r>
+              <w:rPr>
+                <w:b w:val="0"/>
+                <w:sz w:val="17"/>
+              </w:rPr>
+              <w:t>10% de lo que entre</w:t>
+            </w:r>
+          </w:p>
+        </w:tc>
+        <w:tc>
+          <w:tcPr>
+            <w:tcW w:type="dxa" w:w="5329"/>
+          </w:tcPr>
+          <w:p>
+            <w:pPr>
+              <w:spacing w:after="0"/>
+            </w:pPr>
+            <w:r>
+              <w:rPr>
+                <w:b w:val="0"/>
+                <w:sz w:val="17"/>
+              </w:rPr>
+              <w:t>Si la academia te entrega a alguien ya avanzado para que lo cierres, te pagan comisión, pero no cuenta para los 10.</w:t>
+            </w:r>
+          </w:p>
+        </w:tc>
+      </w:tr>
+      <w:tr>
+        <w:tc>
+          <w:tcPr>
+            <w:tcW w:type="dxa" w:w="2041"/>
+          </w:tcPr>
+          <w:p>
+            <w:pPr>
+              <w:spacing w:after="0"/>
+            </w:pPr>
+            <w:r>
+              <w:rPr>
+                <w:b/>
+                <w:sz w:val="17"/>
+              </w:rPr>
+              <w:t>El 4 de noviembre</w:t>
+            </w:r>
+          </w:p>
+        </w:tc>
+        <w:tc>
+          <w:tcPr>
+            <w:tcW w:type="dxa" w:w="2835"/>
+          </w:tcPr>
+          <w:p>
+            <w:pPr>
+              <w:spacing w:after="0"/>
+            </w:pPr>
+            <w:r>
+              <w:rPr>
+                <w:b w:val="0"/>
+                <w:sz w:val="17"/>
+              </w:rPr>
+              <w:t>Contrato laboral según resultado</w:t>
+            </w:r>
+          </w:p>
+        </w:tc>
+        <w:tc>
+          <w:tcPr>
+            <w:tcW w:type="dxa" w:w="5329"/>
+          </w:tcPr>
+          <w:p>
+            <w:pPr>
+              <w:spacing w:after="0"/>
+            </w:pPr>
+            <w:r>
+              <w:rPr>
+                <w:b w:val="0"/>
+                <w:sz w:val="17"/>
+              </w:rPr>
+              <w:t>10 o más: contrato con la meta a tu ritmo (noviembre 10, diciembre 12, enero 15). 5 a 9: contrato con los indicadores estándar del cargo. Menos de 5: termina el reto; se pagan honorarios y comisión.</w:t>
+            </w:r>
+          </w:p>
+        </w:tc>
+      </w:tr>
+    </w:tbl>
+    <w:p>
+      <w:pPr>
+        <w:spacing w:after="0" w:line="60" w:lineRule="exact"/>
+      </w:pPr>
+      <w:r>
+        <w:rPr>
+          <w:sz w:val="2"/>
+        </w:rPr>
+      </w:r>
+    </w:p>
+    <w:tbl>
+      <w:tblPr>
+        <w:tblStyle w:val="TableGrid"/>
+        <w:tblW w:type="auto" w:w="0"/>
+        <w:tblLook w:firstColumn="1" w:firstRow="1" w:lastColumn="0" w:lastRow="0" w:noHBand="0" w:noVBand="1" w:val="04A0"/>
+      </w:tblPr>
+      <w:tblGrid>
+        <w:gridCol w:w="10540"/>
+      </w:tblGrid>
+      <w:tr>
+        <w:tc>
+          <w:tcPr>
+            <w:tcW w:type="dxa" w:w="10540"/>
+            <w:shd w:val="clear" w:color="auto" w:fill="FFF8E7"/>
+          </w:tcPr>
+          <w:p>
+            <w:pPr>
+              <w:spacing w:after="20"/>
+            </w:pPr>
+            <w:r>
+              <w:rPr>
+                <w:b w:val="0"/>
+                <w:sz w:val="19"/>
+              </w:rPr>
+              <w:t>Con los 10 inscritos pagados: 10 cupos pagados por la empresa ($4.350.000 c/u) = $6.350.000 para ti · 10 completos pagados por empleados ($4.782.800 c/u) = $6.782.800 · 10 Arranques ($2.990.000 c/u) = $4.990.000. Siempre: honorarios + bono + comisión.</w:t>
+            </w:r>
+          </w:p>
+        </w:tc>
+      </w:tr>
+    </w:tbl>
+    <w:p>
+      <w:pPr>
+        <w:spacing w:after="0" w:line="60" w:lineRule="exact"/>
+      </w:pPr>
+      <w:r>
+        <w:rPr>
+          <w:sz w:val="2"/>
+        </w:rPr>
       </w:r>
     </w:p>
     <w:sectPr>

</xml_diff>

<commit_message>
Reto: meta 10 inscritos pagados o 30M en caja (lo que llegue primero), cualquier programa; Excel con caja acumulada; 8:30
Co-Authored-By: Claude Fable 5.1 <noreply@anthropic.com>
</commit_message>
<xml_diff>
--- a/recursos/comercial/INDUCCION_COMERCIAL/contratacion comercial/KIT_ARRANQUE_RETO_15_DIAS_ALIANZAS.docx
+++ b/recursos/comercial/INDUCCION_COMERCIAL/contratacion comercial/KIT_ARRANQUE_RETO_15_DIAS_ALIANZAS.docx
@@ -53,14 +53,28 @@
                 <w:b/>
                 <w:sz w:val="19"/>
               </w:rPr>
-              <w:t>Tu meta única:</w:t>
+              <w:t>Tu meta:</w:t>
             </w:r>
             <w:r>
               <w:rPr>
                 <w:b w:val="0"/>
                 <w:sz w:val="19"/>
               </w:rPr>
-              <w:t xml:space="preserve"> 10 personas inscritas y pagadas en la cuenta de Heiiu al martes 3 de noviembre a las 6:00 p. m., traídas por ti: empresas, referidos o conocidos. Cada persona queda registrada en tu planilla antes de pagar. Inscrito pagado = pagó de contado, o pagó la inicial de su plan de pagos y firmó el contrato con coordinación. Lo ideal es de contado.</w:t>
+              <w:t xml:space="preserve"> 10 personas inscritas y pagadas, </w:t>
+            </w:r>
+            <w:r>
+              <w:rPr>
+                <w:b/>
+                <w:sz w:val="19"/>
+              </w:rPr>
+              <w:t>o $30.000.000 en caja</w:t>
+            </w:r>
+            <w:r>
+              <w:rPr>
+                <w:b w:val="0"/>
+                <w:sz w:val="19"/>
+              </w:rPr>
+              <w:t xml:space="preserve"> de Heiiu, lo que llegue primero, al martes 3 de noviembre a las 6:00 p. m., traídas por ti: empresas, referidos o conocidos, de cualquier programa (completo, parcial, Arranque, plan empresa o inglés para empresarios). Cada persona queda registrada en tu planilla antes de pagar. Inscrito pagado = pagó de contado, o pagó la inicial de su plan de pagos y firmó el contrato con coordinación. Caja = dinero verificado en la cuenta de Heiiu. Lo ideal es de contado: 7 completos de contado ya son la meta.</w:t>
             </w:r>
           </w:p>
           <w:p>
@@ -2833,7 +2847,7 @@
                 <w:b w:val="0"/>
                 <w:sz w:val="17"/>
               </w:rPr>
-              <w:t>De contado. Tú lo agendas con gerencia, que arma el plan con él. Cuenta para tu comisión; para la meta cuenta como un inscrito si paga el paquete de 30 horas.</w:t>
+              <w:t>De contado. Tú lo agendas con gerencia, que arma el plan con él. Cuenta para tu comisión y para la caja de la meta.</w:t>
             </w:r>
           </w:p>
         </w:tc>
@@ -3346,21 +3360,21 @@
                 <w:b/>
                 <w:sz w:val="18"/>
               </w:rPr>
-              <w:t>Qué cuenta como "inscrito pagado" para el reto:</w:t>
+              <w:t>Qué cuenta para la meta:</w:t>
             </w:r>
             <w:r>
               <w:rPr>
                 <w:b w:val="0"/>
                 <w:sz w:val="18"/>
               </w:rPr>
-              <w:t xml:space="preserve"> pagó de contado, o pagó la inicial de su plan de pagos y firmó el contrato con coordinación, </w:t>
+              <w:t xml:space="preserve"> inscrito pagado = pagó de contado, o pagó la inicial de su plan de pagos y firmó el contrato con coordinación; caja = todo lo que entre a la cuenta de Heiiu por tus ventas, de cualquier programa, </w:t>
             </w:r>
             <w:r>
               <w:rPr>
                 <w:b/>
                 <w:sz w:val="18"/>
               </w:rPr>
-              <w:t>en la cuenta de Heiiu y verificado por coordinación,</w:t>
+              <w:t>verificado por coordinación,</w:t>
             </w:r>
             <w:r>
               <w:rPr>
@@ -4292,7 +4306,7 @@
                 <w:b w:val="0"/>
                 <w:sz w:val="17"/>
               </w:rPr>
-              <w:t xml:space="preserve"> inscritos pagados y verificados por coordinación. Planilla cerrada y cuenta de cobro. Ese mismo día abre el grupo del 3 de noviembre.</w:t>
+              <w:t xml:space="preserve"> inscritos pagados y caja, verificados por coordinación. Planilla cerrada y cuenta de cobro. Ese mismo día abre el grupo del 3 de noviembre.</w:t>
             </w:r>
           </w:p>
         </w:tc>
@@ -4919,7 +4933,7 @@
                 <w:b w:val="0"/>
                 <w:sz w:val="17"/>
               </w:rPr>
-              <w:t>Solo si llegas a 10 inscritos pagados al 3 de noviembre a las 6:00 p. m.</w:t>
+              <w:t>Solo si llegas a la meta al 3 de noviembre a las 6:00 p. m.: 10 inscritos pagados o $30.000.000 en caja, lo que llegue primero.</w:t>
             </w:r>
           </w:p>
         </w:tc>
@@ -5065,7 +5079,7 @@
                 <w:b w:val="0"/>
                 <w:sz w:val="19"/>
               </w:rPr>
-              <w:t>Con los 10 inscritos pagados: 10 cupos pagados por la empresa ($4.350.000 c/u) = $6.350.000 para ti · 10 completos pagados por empleados ($4.782.800 c/u) = $6.782.800 · 10 Arranques ($2.990.000 c/u) = $4.990.000. Siempre: honorarios + bono + comisión.</w:t>
+              <w:t>Ejemplos con la meta cumplida: 7 completos de contado ($4.782.800 c/u) = $33.479.600 de caja = $5.347.960 para ti · 10 cupos pagados por la empresa ($4.350.000 c/u) = $6.350.000 para ti · 10 completos pagados por empleados ($4.782.800 c/u) = $6.782.800 · 10 Arranques ($2.990.000 c/u) = $4.990.000. Siempre: honorarios + bono + comisión.</w:t>
             </w:r>
           </w:p>
         </w:tc>

</xml_diff>